<commit_message>
Edit documentation and add new logo
</commit_message>
<xml_diff>
--- a/gitGut/docs/documentation.docx
+++ b/gitGut/docs/documentation.docx
@@ -1,6 +1,6 @@
 
 <file path=word/document.xml><?xml version="1.0" encoding="utf-8"?>
-<w:document xmlns:wpc="http://schemas.microsoft.com/office/word/2010/wordprocessingCanvas" xmlns:cx="http://schemas.microsoft.com/office/drawing/2014/chartex" xmlns:cx1="http://schemas.microsoft.com/office/drawing/2015/9/8/chartex" xmlns:cx2="http://schemas.microsoft.com/office/drawing/2015/10/21/chartex" xmlns:cx3="http://schemas.microsoft.com/office/drawing/2016/5/9/chartex" xmlns:cx4="http://schemas.microsoft.com/office/drawing/2016/5/10/chartex" xmlns:cx5="http://schemas.microsoft.com/office/drawing/2016/5/11/chartex" xmlns:cx6="http://schemas.microsoft.com/office/drawing/2016/5/12/chartex" xmlns:cx7="http://schemas.microsoft.com/office/drawing/2016/5/13/chartex" xmlns:cx8="http://schemas.microsoft.com/office/drawing/2016/5/14/chartex" xmlns:mc="http://schemas.openxmlformats.org/markup-compatibility/2006" xmlns:aink="http://schemas.microsoft.com/office/drawing/2016/ink" xmlns:am3d="http://schemas.microsoft.com/office/drawing/2017/model3d" xmlns:o="urn:schemas-microsoft-com:office:office" xmlns:oel="http://schemas.microsoft.com/office/2019/extlst" xmlns:r="http://schemas.openxmlformats.org/officeDocument/2006/relationships" xmlns:m="http://schemas.openxmlformats.org/officeDocument/2006/math" xmlns:v="urn:schemas-microsoft-com:vml" xmlns:wp14="http://schemas.microsoft.com/office/word/2010/wordprocessingDrawing" xmlns:wp="http://schemas.openxmlformats.org/drawingml/2006/wordprocessingDrawing" xmlns:w10="urn:schemas-microsoft-com:office:word" xmlns:w="http://schemas.openxmlformats.org/wordprocessingml/2006/main" xmlns:w14="http://schemas.microsoft.com/office/word/2010/wordml" xmlns:w15="http://schemas.microsoft.com/office/word/2012/wordml" xmlns:w16cex="http://schemas.microsoft.com/office/word/2018/wordml/cex" xmlns:w16cid="http://schemas.microsoft.com/office/word/2016/wordml/cid" xmlns:w16="http://schemas.microsoft.com/office/word/2018/wordml" xmlns:w16du="http://schemas.microsoft.com/office/word/2023/wordml/word16du" xmlns:w16sdtdh="http://schemas.microsoft.com/office/word/2020/wordml/sdtdatahash" xmlns:w16sdtfl="http://schemas.microsoft.com/office/word/2024/wordml/sdtformatlock" xmlns:w16se="http://schemas.microsoft.com/office/word/2015/wordml/symex" xmlns:wpg="http://schemas.microsoft.com/office/word/2010/wordprocessingGroup" xmlns:wpi="http://schemas.microsoft.com/office/word/2010/wordprocessingInk" xmlns:wne="http://schemas.microsoft.com/office/word/2006/wordml" xmlns:wps="http://schemas.microsoft.com/office/word/2010/wordprocessingShape" mc:Ignorable="w14 w15 w16se w16cid w16 w16cex w16sdtdh w16sdtfl w16du wp14">
+<w:document xmlns:wpc="http://schemas.microsoft.com/office/word/2010/wordprocessingCanvas" xmlns:cx="http://schemas.microsoft.com/office/drawing/2014/chartex" xmlns:mc="http://schemas.openxmlformats.org/markup-compatibility/2006" xmlns:o="urn:schemas-microsoft-com:office:office" xmlns:r="http://schemas.openxmlformats.org/officeDocument/2006/relationships" xmlns:m="http://schemas.openxmlformats.org/officeDocument/2006/math" xmlns:v="urn:schemas-microsoft-com:vml" xmlns:wp14="http://schemas.microsoft.com/office/word/2010/wordprocessingDrawing" xmlns:wp="http://schemas.openxmlformats.org/drawingml/2006/wordprocessingDrawing" xmlns:w10="urn:schemas-microsoft-com:office:word" xmlns:w="http://schemas.openxmlformats.org/wordprocessingml/2006/main" xmlns:w14="http://schemas.microsoft.com/office/word/2010/wordml" xmlns:w15="http://schemas.microsoft.com/office/word/2012/wordml" xmlns:w16se="http://schemas.microsoft.com/office/word/2015/wordml/symex" xmlns:wpg="http://schemas.microsoft.com/office/word/2010/wordprocessingGroup" xmlns:wpi="http://schemas.microsoft.com/office/word/2010/wordprocessingInk" xmlns:wne="http://schemas.microsoft.com/office/word/2006/wordml" xmlns:wps="http://schemas.microsoft.com/office/word/2010/wordprocessingShape" mc:Ignorable="w14 w15 w16se wp14">
   <w:background w:color="FFFFFF" w:themeColor="background1"/>
   <w:body>
     <w:p>
@@ -23,6 +23,7 @@
           <w:noProof/>
           <w:sz w:val="24"/>
           <w:szCs w:val="24"/>
+          <w:lang w:eastAsia="bg-BG"/>
         </w:rPr>
         <w:drawing>
           <wp:anchor distT="0" distB="0" distL="114300" distR="114300" simplePos="0" relativeHeight="251746304" behindDoc="0" locked="0" layoutInCell="1" allowOverlap="1" wp14:anchorId="6D43BEBF" wp14:editId="3FF8F19B">
@@ -92,7 +93,13 @@
     <w:sdt>
       <w:sdtPr>
         <w:rPr>
+          <w:rFonts w:asciiTheme="minorHAnsi" w:eastAsiaTheme="minorHAnsi" w:hAnsiTheme="minorHAnsi" w:cstheme="minorBidi"/>
+          <w:color w:val="auto"/>
+          <w:kern w:val="2"/>
+          <w:sz w:val="22"/>
+          <w:szCs w:val="22"/>
           <w:lang w:val="en-GB"/>
+          <w14:ligatures w14:val="standardContextual"/>
         </w:rPr>
         <w:id w:val="-45838922"/>
         <w:docPartObj>
@@ -102,20 +109,14 @@
       </w:sdtPr>
       <w:sdtEndPr>
         <w:rPr>
-          <w:rFonts w:asciiTheme="minorHAnsi" w:eastAsiaTheme="minorHAnsi" w:hAnsiTheme="minorHAnsi" w:cstheme="minorBidi"/>
           <w:b/>
           <w:bCs/>
-          <w:color w:val="auto"/>
-          <w:kern w:val="2"/>
-          <w:sz w:val="22"/>
-          <w:szCs w:val="22"/>
-          <w14:ligatures w14:val="standardContextual"/>
         </w:rPr>
       </w:sdtEndPr>
       <w:sdtContent>
         <w:p>
           <w:pPr>
-            <w:pStyle w:val="TOCHeading"/>
+            <w:pStyle w:val="af"/>
           </w:pPr>
           <w:r>
             <w:rPr>
@@ -126,7 +127,7 @@
         </w:p>
         <w:p>
           <w:pPr>
-            <w:pStyle w:val="TOC2"/>
+            <w:pStyle w:val="21"/>
             <w:tabs>
               <w:tab w:val="left" w:pos="720"/>
               <w:tab w:val="right" w:leader="dot" w:pos="9062"/>
@@ -151,7 +152,7 @@
           <w:hyperlink w:anchor="_Toc193022569" w:history="1">
             <w:r>
               <w:rPr>
-                <w:rStyle w:val="Hyperlink"/>
+                <w:rStyle w:val="ae"/>
                 <w:rFonts w:ascii="Poppins" w:hAnsi="Poppins" w:cs="Poppins"/>
                 <w:noProof/>
               </w:rPr>
@@ -169,7 +170,7 @@
             </w:r>
             <w:r>
               <w:rPr>
-                <w:rStyle w:val="Hyperlink"/>
+                <w:rStyle w:val="ae"/>
                 <w:rFonts w:ascii="Poppins" w:hAnsi="Poppins" w:cs="Poppins"/>
                 <w:noProof/>
               </w:rPr>
@@ -227,7 +228,7 @@
         </w:p>
         <w:p>
           <w:pPr>
-            <w:pStyle w:val="TOC1"/>
+            <w:pStyle w:val="11"/>
             <w:tabs>
               <w:tab w:val="left" w:pos="440"/>
               <w:tab w:val="right" w:leader="dot" w:pos="9062"/>
@@ -246,7 +247,7 @@
           <w:hyperlink w:anchor="_Toc193022570" w:history="1">
             <w:r>
               <w:rPr>
-                <w:rStyle w:val="Hyperlink"/>
+                <w:rStyle w:val="ae"/>
                 <w:rFonts w:ascii="Poppins" w:hAnsi="Poppins" w:cs="Poppins"/>
                 <w:noProof/>
               </w:rPr>
@@ -267,7 +268,7 @@
             </w:r>
             <w:r>
               <w:rPr>
-                <w:rStyle w:val="Hyperlink"/>
+                <w:rStyle w:val="ae"/>
                 <w:rFonts w:ascii="Poppins" w:hAnsi="Poppins" w:cs="Poppins"/>
                 <w:noProof/>
               </w:rPr>
@@ -325,7 +326,7 @@
         </w:p>
         <w:p>
           <w:pPr>
-            <w:pStyle w:val="TOC2"/>
+            <w:pStyle w:val="21"/>
             <w:tabs>
               <w:tab w:val="left" w:pos="720"/>
               <w:tab w:val="right" w:leader="dot" w:pos="9062"/>
@@ -341,7 +342,7 @@
           <w:hyperlink w:anchor="_Toc193022571" w:history="1">
             <w:r>
               <w:rPr>
-                <w:rStyle w:val="Hyperlink"/>
+                <w:rStyle w:val="ae"/>
                 <w:rFonts w:ascii="Poppins" w:hAnsi="Poppins" w:cs="Poppins"/>
                 <w:noProof/>
               </w:rPr>
@@ -359,7 +360,7 @@
             </w:r>
             <w:r>
               <w:rPr>
-                <w:rStyle w:val="Hyperlink"/>
+                <w:rStyle w:val="ae"/>
                 <w:rFonts w:ascii="Poppins" w:hAnsi="Poppins" w:cs="Poppins"/>
                 <w:noProof/>
               </w:rPr>
@@ -417,7 +418,7 @@
         </w:p>
         <w:p>
           <w:pPr>
-            <w:pStyle w:val="TOC2"/>
+            <w:pStyle w:val="21"/>
             <w:tabs>
               <w:tab w:val="left" w:pos="720"/>
               <w:tab w:val="right" w:leader="dot" w:pos="9062"/>
@@ -433,7 +434,7 @@
           <w:hyperlink w:anchor="_Toc193022572" w:history="1">
             <w:r>
               <w:rPr>
-                <w:rStyle w:val="Hyperlink"/>
+                <w:rStyle w:val="ae"/>
                 <w:rFonts w:ascii="Poppins" w:hAnsi="Poppins" w:cs="Poppins"/>
                 <w:noProof/>
               </w:rPr>
@@ -451,7 +452,7 @@
             </w:r>
             <w:r>
               <w:rPr>
-                <w:rStyle w:val="Hyperlink"/>
+                <w:rStyle w:val="ae"/>
                 <w:rFonts w:ascii="Poppins" w:hAnsi="Poppins" w:cs="Poppins"/>
                 <w:noProof/>
               </w:rPr>
@@ -509,7 +510,7 @@
         </w:p>
         <w:p>
           <w:pPr>
-            <w:pStyle w:val="TOC2"/>
+            <w:pStyle w:val="21"/>
             <w:tabs>
               <w:tab w:val="left" w:pos="720"/>
               <w:tab w:val="right" w:leader="dot" w:pos="9062"/>
@@ -525,7 +526,7 @@
           <w:hyperlink w:anchor="_Toc193022573" w:history="1">
             <w:r>
               <w:rPr>
-                <w:rStyle w:val="Hyperlink"/>
+                <w:rStyle w:val="ae"/>
                 <w:rFonts w:ascii="Poppins" w:hAnsi="Poppins" w:cs="Poppins"/>
                 <w:noProof/>
               </w:rPr>
@@ -543,7 +544,7 @@
             </w:r>
             <w:r>
               <w:rPr>
-                <w:rStyle w:val="Hyperlink"/>
+                <w:rStyle w:val="ae"/>
                 <w:rFonts w:ascii="Poppins" w:hAnsi="Poppins" w:cs="Poppins"/>
                 <w:noProof/>
               </w:rPr>
@@ -601,7 +602,7 @@
         </w:p>
         <w:p>
           <w:pPr>
-            <w:pStyle w:val="TOC1"/>
+            <w:pStyle w:val="11"/>
             <w:tabs>
               <w:tab w:val="left" w:pos="440"/>
               <w:tab w:val="right" w:leader="dot" w:pos="9062"/>
@@ -620,7 +621,7 @@
           <w:hyperlink w:anchor="_Toc193022574" w:history="1">
             <w:r>
               <w:rPr>
-                <w:rStyle w:val="Hyperlink"/>
+                <w:rStyle w:val="ae"/>
                 <w:rFonts w:ascii="Poppins" w:hAnsi="Poppins" w:cs="Poppins"/>
                 <w:noProof/>
               </w:rPr>
@@ -641,7 +642,7 @@
             </w:r>
             <w:r>
               <w:rPr>
-                <w:rStyle w:val="Hyperlink"/>
+                <w:rStyle w:val="ae"/>
                 <w:rFonts w:ascii="Poppins" w:hAnsi="Poppins" w:cs="Poppins"/>
                 <w:noProof/>
               </w:rPr>
@@ -734,7 +735,7 @@
     </w:p>
     <w:p>
       <w:pPr>
-        <w:pStyle w:val="Heading2"/>
+        <w:pStyle w:val="2"/>
         <w:numPr>
           <w:ilvl w:val="0"/>
           <w:numId w:val="9"/>
@@ -767,7 +768,7 @@
     </w:p>
     <w:tbl>
       <w:tblPr>
-        <w:tblStyle w:val="TableGrid"/>
+        <w:tblStyle w:val="af0"/>
         <w:tblpPr w:leftFromText="141" w:rightFromText="141" w:vertAnchor="text" w:horzAnchor="margin" w:tblpY="65"/>
         <w:tblW w:w="5000" w:type="pct"/>
         <w:tblLook w:val="04A0" w:firstRow="1" w:lastRow="0" w:firstColumn="1" w:lastColumn="0" w:noHBand="0" w:noVBand="1"/>
@@ -1001,6 +1002,7 @@
                 <w:lang w:val="en-US"/>
               </w:rPr>
             </w:pPr>
+            <w:proofErr w:type="spellStart"/>
             <w:r>
               <w:rPr>
                 <w:rFonts w:ascii="Poppins" w:hAnsi="Poppins" w:cs="Poppins"/>
@@ -1008,7 +1010,17 @@
                 <w:szCs w:val="24"/>
                 <w:lang w:val="en-US"/>
               </w:rPr>
-              <w:t xml:space="preserve">Ivelin </w:t>
+              <w:t>Ivelin</w:t>
+            </w:r>
+            <w:proofErr w:type="spellEnd"/>
+            <w:r>
+              <w:rPr>
+                <w:rFonts w:ascii="Poppins" w:hAnsi="Poppins" w:cs="Poppins"/>
+                <w:sz w:val="24"/>
+                <w:szCs w:val="24"/>
+                <w:lang w:val="en-US"/>
+              </w:rPr>
+              <w:t xml:space="preserve"> </w:t>
             </w:r>
             <w:proofErr w:type="spellStart"/>
             <w:r>
@@ -1090,6 +1102,7 @@
                 <w:lang w:val="en-US"/>
               </w:rPr>
             </w:pPr>
+            <w:proofErr w:type="spellStart"/>
             <w:r>
               <w:rPr>
                 <w:rFonts w:ascii="Poppins" w:hAnsi="Poppins" w:cs="Poppins"/>
@@ -1097,7 +1110,17 @@
                 <w:szCs w:val="24"/>
                 <w:lang w:val="en-US"/>
               </w:rPr>
-              <w:t xml:space="preserve">Ivayla </w:t>
+              <w:t>Ivayla</w:t>
+            </w:r>
+            <w:proofErr w:type="spellEnd"/>
+            <w:r>
+              <w:rPr>
+                <w:rFonts w:ascii="Poppins" w:hAnsi="Poppins" w:cs="Poppins"/>
+                <w:sz w:val="24"/>
+                <w:szCs w:val="24"/>
+                <w:lang w:val="en-US"/>
+              </w:rPr>
+              <w:t xml:space="preserve"> </w:t>
             </w:r>
             <w:proofErr w:type="spellStart"/>
             <w:r>
@@ -1271,7 +1294,7 @@
     <w:bookmarkStart w:id="10" w:name="_Toc193022570"/>
     <w:p>
       <w:pPr>
-        <w:pStyle w:val="Heading1"/>
+        <w:pStyle w:val="1"/>
         <w:numPr>
           <w:ilvl w:val="0"/>
           <w:numId w:val="9"/>
@@ -1290,6 +1313,7 @@
           <w:color w:val="auto"/>
           <w:sz w:val="24"/>
           <w:szCs w:val="24"/>
+          <w:lang w:eastAsia="bg-BG"/>
         </w:rPr>
         <mc:AlternateContent>
           <mc:Choice Requires="wps">
@@ -1360,7 +1384,7 @@
               </wp:anchor>
             </w:drawing>
           </mc:Choice>
-          <mc:Fallback>
+          <mc:Fallback xmlns:cx1="http://schemas.microsoft.com/office/drawing/2015/9/8/chartex" xmlns:cx2="http://schemas.microsoft.com/office/drawing/2015/10/21/chartex" xmlns:cx3="http://schemas.microsoft.com/office/drawing/2016/5/9/chartex" xmlns:cx4="http://schemas.microsoft.com/office/drawing/2016/5/10/chartex" xmlns:cx5="http://schemas.microsoft.com/office/drawing/2016/5/11/chartex" xmlns:cx6="http://schemas.microsoft.com/office/drawing/2016/5/12/chartex" xmlns:cx7="http://schemas.microsoft.com/office/drawing/2016/5/13/chartex" xmlns:cx8="http://schemas.microsoft.com/office/drawing/2016/5/14/chartex" xmlns:aink="http://schemas.microsoft.com/office/drawing/2016/ink" xmlns:am3d="http://schemas.microsoft.com/office/drawing/2017/model3d" xmlns:oel="http://schemas.microsoft.com/office/2019/extlst" xmlns:w16cex="http://schemas.microsoft.com/office/word/2018/wordml/cex" xmlns:w16cid="http://schemas.microsoft.com/office/word/2016/wordml/cid" xmlns:w16="http://schemas.microsoft.com/office/word/2018/wordml" xmlns:w16du="http://schemas.microsoft.com/office/word/2023/wordml/word16du" xmlns:w16sdtdh="http://schemas.microsoft.com/office/word/2020/wordml/sdtdatahash" xmlns:w16sdtfl="http://schemas.microsoft.com/office/word/2024/wordml/sdtformatlock">
             <w:pict>
               <v:oval w14:anchorId="561078B3" id="Oval 5" o:spid="_x0000_s1026" style="position:absolute;margin-left:473.75pt;margin-top:656.2pt;width:192pt;height:195pt;z-index:251700224;visibility:visible;mso-wrap-style:square;mso-width-percent:0;mso-height-percent:0;mso-wrap-distance-left:9pt;mso-wrap-distance-top:0;mso-wrap-distance-right:9pt;mso-wrap-distance-bottom:0;mso-position-horizontal:absolute;mso-position-horizontal-relative:text;mso-position-vertical:absolute;mso-position-vertical-relative:text;mso-width-percent:0;mso-height-percent:0;mso-width-relative:margin;mso-height-relative:margin;v-text-anchor:middle" o:gfxdata="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" fillcolor="white [3212]" stroked="f" strokeweight="1pt">
                 <v:stroke joinstyle="miter"/>
@@ -1415,7 +1439,7 @@
     <w:bookmarkStart w:id="12" w:name="_Toc193022571"/>
     <w:p>
       <w:pPr>
-        <w:pStyle w:val="Heading2"/>
+        <w:pStyle w:val="2"/>
         <w:numPr>
           <w:ilvl w:val="0"/>
           <w:numId w:val="9"/>
@@ -1434,6 +1458,7 @@
           <w:color w:val="auto"/>
           <w:sz w:val="24"/>
           <w:szCs w:val="24"/>
+          <w:lang w:eastAsia="bg-BG"/>
         </w:rPr>
         <mc:AlternateContent>
           <mc:Choice Requires="wps">
@@ -1504,7 +1529,7 @@
               </wp:anchor>
             </w:drawing>
           </mc:Choice>
-          <mc:Fallback>
+          <mc:Fallback xmlns:cx1="http://schemas.microsoft.com/office/drawing/2015/9/8/chartex" xmlns:cx2="http://schemas.microsoft.com/office/drawing/2015/10/21/chartex" xmlns:cx3="http://schemas.microsoft.com/office/drawing/2016/5/9/chartex" xmlns:cx4="http://schemas.microsoft.com/office/drawing/2016/5/10/chartex" xmlns:cx5="http://schemas.microsoft.com/office/drawing/2016/5/11/chartex" xmlns:cx6="http://schemas.microsoft.com/office/drawing/2016/5/12/chartex" xmlns:cx7="http://schemas.microsoft.com/office/drawing/2016/5/13/chartex" xmlns:cx8="http://schemas.microsoft.com/office/drawing/2016/5/14/chartex" xmlns:aink="http://schemas.microsoft.com/office/drawing/2016/ink" xmlns:am3d="http://schemas.microsoft.com/office/drawing/2017/model3d" xmlns:oel="http://schemas.microsoft.com/office/2019/extlst" xmlns:w16cex="http://schemas.microsoft.com/office/word/2018/wordml/cex" xmlns:w16cid="http://schemas.microsoft.com/office/word/2016/wordml/cid" xmlns:w16="http://schemas.microsoft.com/office/word/2018/wordml" xmlns:w16du="http://schemas.microsoft.com/office/word/2023/wordml/word16du" xmlns:w16sdtdh="http://schemas.microsoft.com/office/word/2020/wordml/sdtdatahash" xmlns:w16sdtfl="http://schemas.microsoft.com/office/word/2024/wordml/sdtformatlock">
             <w:pict>
               <v:oval w14:anchorId="2744D7BB" id="Oval 5" o:spid="_x0000_s1026" style="position:absolute;margin-left:390.65pt;margin-top:645.5pt;width:228.8pt;height:231.95pt;z-index:251705344;visibility:visible;mso-wrap-style:square;mso-width-percent:0;mso-height-percent:0;mso-wrap-distance-left:9pt;mso-wrap-distance-top:0;mso-wrap-distance-right:9pt;mso-wrap-distance-bottom:0;mso-position-horizontal:absolute;mso-position-horizontal-relative:text;mso-position-vertical:absolute;mso-position-vertical-relative:text;mso-width-percent:0;mso-height-percent:0;mso-width-relative:margin;mso-height-relative:margin;v-text-anchor:middle" o:gfxdata="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" fillcolor="white [3212]" stroked="f" strokeweight="1pt">
                 <v:stroke joinstyle="miter"/>
@@ -1520,6 +1545,7 @@
           <w:color w:val="auto"/>
           <w:sz w:val="24"/>
           <w:szCs w:val="24"/>
+          <w:lang w:eastAsia="bg-BG"/>
         </w:rPr>
         <mc:AlternateContent>
           <mc:Choice Requires="wps">
@@ -1571,7 +1597,7 @@
               </wp:anchor>
             </w:drawing>
           </mc:Choice>
-          <mc:Fallback>
+          <mc:Fallback xmlns:cx1="http://schemas.microsoft.com/office/drawing/2015/9/8/chartex" xmlns:cx2="http://schemas.microsoft.com/office/drawing/2015/10/21/chartex" xmlns:cx3="http://schemas.microsoft.com/office/drawing/2016/5/9/chartex" xmlns:cx4="http://schemas.microsoft.com/office/drawing/2016/5/10/chartex" xmlns:cx5="http://schemas.microsoft.com/office/drawing/2016/5/11/chartex" xmlns:cx6="http://schemas.microsoft.com/office/drawing/2016/5/12/chartex" xmlns:cx7="http://schemas.microsoft.com/office/drawing/2016/5/13/chartex" xmlns:cx8="http://schemas.microsoft.com/office/drawing/2016/5/14/chartex" xmlns:aink="http://schemas.microsoft.com/office/drawing/2016/ink" xmlns:am3d="http://schemas.microsoft.com/office/drawing/2017/model3d" xmlns:oel="http://schemas.microsoft.com/office/2019/extlst" xmlns:w16cex="http://schemas.microsoft.com/office/word/2018/wordml/cex" xmlns:w16cid="http://schemas.microsoft.com/office/word/2016/wordml/cid" xmlns:w16="http://schemas.microsoft.com/office/word/2018/wordml" xmlns:w16du="http://schemas.microsoft.com/office/word/2023/wordml/word16du" xmlns:w16sdtdh="http://schemas.microsoft.com/office/word/2020/wordml/sdtdatahash" xmlns:w16sdtfl="http://schemas.microsoft.com/office/word/2024/wordml/sdtformatlock">
             <w:pict>
               <v:oval w14:anchorId="0D4822CC" id="Oval 5" o:spid="_x0000_s1026" style="position:absolute;margin-left:352.6pt;margin-top:614.75pt;width:347pt;height:337.25pt;z-index:251698176;visibility:visible;mso-wrap-style:square;mso-wrap-distance-left:9pt;mso-wrap-distance-top:0;mso-wrap-distance-right:9pt;mso-wrap-distance-bottom:0;mso-position-horizontal:absolute;mso-position-horizontal-relative:text;mso-position-vertical:absolute;mso-position-vertical-relative:text;v-text-anchor:middle" o:gfxdata="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" fillcolor="#e9caa5" stroked="f" strokeweight="1pt">
                 <v:stroke joinstyle="miter"/>
@@ -1587,6 +1613,7 @@
           <w:color w:val="auto"/>
           <w:sz w:val="24"/>
           <w:szCs w:val="24"/>
+          <w:lang w:eastAsia="bg-BG"/>
         </w:rPr>
         <mc:AlternateContent>
           <mc:Choice Requires="wps">
@@ -1638,7 +1665,7 @@
               </wp:anchor>
             </w:drawing>
           </mc:Choice>
-          <mc:Fallback>
+          <mc:Fallback xmlns:cx1="http://schemas.microsoft.com/office/drawing/2015/9/8/chartex" xmlns:cx2="http://schemas.microsoft.com/office/drawing/2015/10/21/chartex" xmlns:cx3="http://schemas.microsoft.com/office/drawing/2016/5/9/chartex" xmlns:cx4="http://schemas.microsoft.com/office/drawing/2016/5/10/chartex" xmlns:cx5="http://schemas.microsoft.com/office/drawing/2016/5/11/chartex" xmlns:cx6="http://schemas.microsoft.com/office/drawing/2016/5/12/chartex" xmlns:cx7="http://schemas.microsoft.com/office/drawing/2016/5/13/chartex" xmlns:cx8="http://schemas.microsoft.com/office/drawing/2016/5/14/chartex" xmlns:aink="http://schemas.microsoft.com/office/drawing/2016/ink" xmlns:am3d="http://schemas.microsoft.com/office/drawing/2017/model3d" xmlns:oel="http://schemas.microsoft.com/office/2019/extlst" xmlns:w16cex="http://schemas.microsoft.com/office/word/2018/wordml/cex" xmlns:w16cid="http://schemas.microsoft.com/office/word/2016/wordml/cid" xmlns:w16="http://schemas.microsoft.com/office/word/2018/wordml" xmlns:w16du="http://schemas.microsoft.com/office/word/2023/wordml/word16du" xmlns:w16sdtdh="http://schemas.microsoft.com/office/word/2020/wordml/sdtdatahash" xmlns:w16sdtfl="http://schemas.microsoft.com/office/word/2024/wordml/sdtformatlock">
             <w:pict>
               <v:oval w14:anchorId="04861973" id="Oval 5" o:spid="_x0000_s1026" style="position:absolute;margin-left:-262.15pt;margin-top:649.85pt;width:347pt;height:337.25pt;z-index:251694080;visibility:visible;mso-wrap-style:square;mso-wrap-distance-left:9pt;mso-wrap-distance-top:0;mso-wrap-distance-right:9pt;mso-wrap-distance-bottom:0;mso-position-horizontal:absolute;mso-position-horizontal-relative:text;mso-position-vertical:absolute;mso-position-vertical-relative:text;v-text-anchor:middle" o:gfxdata="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" fillcolor="#e9caa5" stroked="f" strokeweight="1pt">
                 <v:stroke joinstyle="miter"/>
@@ -1706,7 +1733,7 @@
     </w:p>
     <w:tbl>
       <w:tblPr>
-        <w:tblStyle w:val="TableGrid"/>
+        <w:tblStyle w:val="af0"/>
         <w:tblpPr w:leftFromText="141" w:rightFromText="141" w:vertAnchor="text" w:horzAnchor="margin" w:tblpY="65"/>
         <w:tblW w:w="9184" w:type="dxa"/>
         <w:tblLook w:val="04A0" w:firstRow="1" w:lastRow="0" w:firstColumn="1" w:lastColumn="0" w:noHBand="0" w:noVBand="1"/>
@@ -2503,7 +2530,27 @@
                 <w:szCs w:val="24"/>
                 <w:lang w:val="en-US"/>
               </w:rPr>
-              <w:t xml:space="preserve"> &amp; Canva and for the QA documentation we </w:t>
+              <w:t xml:space="preserve"> &amp; </w:t>
+            </w:r>
+            <w:proofErr w:type="spellStart"/>
+            <w:r>
+              <w:rPr>
+                <w:rFonts w:ascii="Poppins" w:hAnsi="Poppins" w:cs="Poppins"/>
+                <w:sz w:val="24"/>
+                <w:szCs w:val="24"/>
+                <w:lang w:val="en-US"/>
+              </w:rPr>
+              <w:t>Canva</w:t>
+            </w:r>
+            <w:proofErr w:type="spellEnd"/>
+            <w:r>
+              <w:rPr>
+                <w:rFonts w:ascii="Poppins" w:hAnsi="Poppins" w:cs="Poppins"/>
+                <w:sz w:val="24"/>
+                <w:szCs w:val="24"/>
+                <w:lang w:val="en-US"/>
+              </w:rPr>
+              <w:t xml:space="preserve"> and for the QA documentation we </w:t>
             </w:r>
             <w:r>
               <w:rPr>
@@ -2529,7 +2576,7 @@
     </w:tbl>
     <w:p>
       <w:pPr>
-        <w:pStyle w:val="Heading2"/>
+        <w:pStyle w:val="2"/>
         <w:numPr>
           <w:ilvl w:val="0"/>
           <w:numId w:val="9"/>
@@ -2557,7 +2604,7 @@
     </w:p>
     <w:tbl>
       <w:tblPr>
-        <w:tblStyle w:val="TableGrid"/>
+        <w:tblStyle w:val="af0"/>
         <w:tblpPr w:leftFromText="141" w:rightFromText="141" w:vertAnchor="text" w:horzAnchor="margin" w:tblpY="315"/>
         <w:tblW w:w="9184" w:type="dxa"/>
         <w:tblLook w:val="04A0" w:firstRow="1" w:lastRow="0" w:firstColumn="1" w:lastColumn="0" w:noHBand="0" w:noVBand="1"/>
@@ -2804,7 +2851,7 @@
     </w:p>
     <w:p>
       <w:pPr>
-        <w:pStyle w:val="Heading2"/>
+        <w:pStyle w:val="2"/>
         <w:numPr>
           <w:ilvl w:val="0"/>
           <w:numId w:val="9"/>
@@ -2840,9 +2887,10 @@
         <w:t xml:space="preserve"> </w:t>
       </w:r>
     </w:p>
+    <w:bookmarkStart w:id="25" w:name="_Toc193022574"/>
     <w:p>
       <w:pPr>
-        <w:pStyle w:val="Heading1"/>
+        <w:pStyle w:val="1"/>
         <w:numPr>
           <w:ilvl w:val="0"/>
           <w:numId w:val="9"/>
@@ -2854,7 +2902,6 @@
           <w:lang w:val="en-US"/>
         </w:rPr>
       </w:pPr>
-      <w:bookmarkStart w:id="25" w:name="_Toc193022574"/>
       <w:r>
         <w:rPr>
           <w:rFonts w:ascii="Poppins" w:hAnsi="Poppins" w:cs="Poppins"/>
@@ -2862,6 +2909,7 @@
           <w:color w:val="auto"/>
           <w:sz w:val="24"/>
           <w:szCs w:val="24"/>
+          <w:lang w:eastAsia="bg-BG"/>
         </w:rPr>
         <mc:AlternateContent>
           <mc:Choice Requires="wps">
@@ -2934,7 +2982,7 @@
               </wp:anchor>
             </w:drawing>
           </mc:Choice>
-          <mc:Fallback>
+          <mc:Fallback xmlns:cx1="http://schemas.microsoft.com/office/drawing/2015/9/8/chartex" xmlns:cx2="http://schemas.microsoft.com/office/drawing/2015/10/21/chartex" xmlns:cx3="http://schemas.microsoft.com/office/drawing/2016/5/9/chartex" xmlns:cx4="http://schemas.microsoft.com/office/drawing/2016/5/10/chartex" xmlns:cx5="http://schemas.microsoft.com/office/drawing/2016/5/11/chartex" xmlns:cx6="http://schemas.microsoft.com/office/drawing/2016/5/12/chartex" xmlns:cx7="http://schemas.microsoft.com/office/drawing/2016/5/13/chartex" xmlns:cx8="http://schemas.microsoft.com/office/drawing/2016/5/14/chartex" xmlns:aink="http://schemas.microsoft.com/office/drawing/2016/ink" xmlns:am3d="http://schemas.microsoft.com/office/drawing/2017/model3d" xmlns:oel="http://schemas.microsoft.com/office/2019/extlst" xmlns:w16cex="http://schemas.microsoft.com/office/word/2018/wordml/cex" xmlns:w16cid="http://schemas.microsoft.com/office/word/2016/wordml/cid" xmlns:w16="http://schemas.microsoft.com/office/word/2018/wordml" xmlns:w16du="http://schemas.microsoft.com/office/word/2023/wordml/word16du" xmlns:w16sdtdh="http://schemas.microsoft.com/office/word/2020/wordml/sdtdatahash" xmlns:w16sdtfl="http://schemas.microsoft.com/office/word/2024/wordml/sdtformatlock">
             <w:pict>
               <v:oval w14:anchorId="53FCF880" id="Oval 36" o:spid="_x0000_s1026" style="position:absolute;margin-left:-16.85pt;margin-top:131.95pt;width:186pt;height:210pt;z-index:251743232;visibility:visible;mso-wrap-style:square;mso-width-percent:0;mso-height-percent:0;mso-wrap-distance-left:9pt;mso-wrap-distance-top:0;mso-wrap-distance-right:9pt;mso-wrap-distance-bottom:0;mso-position-horizontal:absolute;mso-position-horizontal-relative:right-margin-area;mso-position-vertical:absolute;mso-position-vertical-relative:text;mso-width-percent:0;mso-height-percent:0;mso-width-relative:margin;mso-height-relative:margin;v-text-anchor:middle" o:gfxdata="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" fillcolor="white [3212]" strokecolor="white [3212]" strokeweight="1pt">
                 <v:stroke joinstyle="miter"/>
@@ -2951,6 +2999,7 @@
           <w:color w:val="auto"/>
           <w:sz w:val="24"/>
           <w:szCs w:val="24"/>
+          <w:lang w:eastAsia="bg-BG"/>
         </w:rPr>
         <w:drawing>
           <wp:anchor distT="0" distB="0" distL="114300" distR="114300" simplePos="0" relativeHeight="251747328" behindDoc="0" locked="0" layoutInCell="1" allowOverlap="1" wp14:anchorId="0E9AD527" wp14:editId="62630918">
@@ -3022,87 +3071,2104 @@
     </w:p>
     <w:p>
       <w:pPr>
-        <w:pStyle w:val="ListParagraph"/>
-        <w:rPr>
-          <w:rFonts w:ascii="Poppins" w:hAnsi="Poppins" w:cs="Poppins"/>
-          <w:sz w:val="24"/>
-          <w:szCs w:val="24"/>
-          <w:lang w:val="en-US"/>
-        </w:rPr>
-      </w:pPr>
-      <w:r>
-        <w:rPr>
-          <w:rFonts w:ascii="Poppins" w:hAnsi="Poppins" w:cs="Poppins"/>
-          <w:sz w:val="24"/>
-          <w:szCs w:val="24"/>
-          <w:lang w:val="en-US"/>
-        </w:rPr>
-        <w:t xml:space="preserve">We are happy with what we </w:t>
-      </w:r>
-      <w:r>
-        <w:rPr>
-          <w:rFonts w:ascii="Poppins" w:hAnsi="Poppins" w:cs="Poppins"/>
-          <w:sz w:val="24"/>
-          <w:szCs w:val="24"/>
-          <w:lang w:val="en-US"/>
-        </w:rPr>
-        <w:t>did</w:t>
-      </w:r>
-      <w:r>
-        <w:rPr>
-          <w:rFonts w:ascii="Poppins" w:hAnsi="Poppins" w:cs="Poppins"/>
-          <w:sz w:val="24"/>
-          <w:szCs w:val="24"/>
-          <w:lang w:val="en-US"/>
-        </w:rPr>
-        <w:t xml:space="preserve"> during the one month period that we had, but our project have potential for more realization. We want </w:t>
-      </w:r>
-      <w:r>
-        <w:rPr>
-          <w:rFonts w:ascii="Poppins" w:hAnsi="Poppins" w:cs="Poppins"/>
-          <w:sz w:val="24"/>
-          <w:szCs w:val="24"/>
-          <w:lang w:val="en-US"/>
-        </w:rPr>
-        <w:t>to use</w:t>
-      </w:r>
-      <w:r>
-        <w:rPr>
-          <w:rFonts w:ascii="Poppins" w:hAnsi="Poppins" w:cs="Poppins"/>
-          <w:sz w:val="24"/>
-          <w:szCs w:val="24"/>
-          <w:lang w:val="en-US"/>
+        <w:spacing w:before="100" w:beforeAutospacing="1" w:after="100" w:afterAutospacing="1"/>
+        <w:rPr>
+          <w:rFonts w:ascii="Times New Roman" w:eastAsia="Times New Roman" w:hAnsi="Times New Roman" w:cs="Times New Roman"/>
+          <w:kern w:val="0"/>
+          <w:sz w:val="24"/>
+          <w:szCs w:val="24"/>
+          <w:lang w:eastAsia="bg-BG"/>
+          <w14:ligatures w14:val="none"/>
+        </w:rPr>
+      </w:pPr>
+      <w:proofErr w:type="spellStart"/>
+      <w:r>
+        <w:rPr>
+          <w:rFonts w:ascii="Times New Roman" w:eastAsia="Times New Roman" w:hAnsi="Times New Roman" w:cs="Times New Roman"/>
+          <w:kern w:val="0"/>
+          <w:sz w:val="24"/>
+          <w:szCs w:val="24"/>
+          <w:lang w:eastAsia="bg-BG"/>
+          <w14:ligatures w14:val="none"/>
+        </w:rPr>
+        <w:t>We</w:t>
+      </w:r>
+      <w:proofErr w:type="spellEnd"/>
+      <w:r>
+        <w:rPr>
+          <w:rFonts w:ascii="Times New Roman" w:eastAsia="Times New Roman" w:hAnsi="Times New Roman" w:cs="Times New Roman"/>
+          <w:kern w:val="0"/>
+          <w:sz w:val="24"/>
+          <w:szCs w:val="24"/>
+          <w:lang w:eastAsia="bg-BG"/>
+          <w14:ligatures w14:val="none"/>
         </w:rPr>
         <w:t xml:space="preserve"> </w:t>
       </w:r>
-      <w:r>
-        <w:rPr>
-          <w:rFonts w:ascii="Poppins" w:hAnsi="Poppins" w:cs="Poppins"/>
-          <w:sz w:val="24"/>
-          <w:szCs w:val="24"/>
-          <w:lang w:val="en-US"/>
+      <w:proofErr w:type="spellStart"/>
+      <w:r>
+        <w:rPr>
+          <w:rFonts w:ascii="Times New Roman" w:eastAsia="Times New Roman" w:hAnsi="Times New Roman" w:cs="Times New Roman"/>
+          <w:kern w:val="0"/>
+          <w:sz w:val="24"/>
+          <w:szCs w:val="24"/>
+          <w:lang w:eastAsia="bg-BG"/>
+          <w14:ligatures w14:val="none"/>
+        </w:rPr>
+        <w:t>are</w:t>
+      </w:r>
+      <w:proofErr w:type="spellEnd"/>
+      <w:r>
+        <w:rPr>
+          <w:rFonts w:ascii="Times New Roman" w:eastAsia="Times New Roman" w:hAnsi="Times New Roman" w:cs="Times New Roman"/>
+          <w:kern w:val="0"/>
+          <w:sz w:val="24"/>
+          <w:szCs w:val="24"/>
+          <w:lang w:eastAsia="bg-BG"/>
+          <w14:ligatures w14:val="none"/>
+        </w:rPr>
+        <w:t xml:space="preserve"> </w:t>
+      </w:r>
+      <w:r>
+        <w:rPr>
+          <w:rFonts w:ascii="Times New Roman" w:eastAsia="Times New Roman" w:hAnsi="Times New Roman" w:cs="Times New Roman"/>
+          <w:kern w:val="0"/>
+          <w:sz w:val="24"/>
+          <w:szCs w:val="24"/>
+          <w:lang w:val="en-US" w:eastAsia="bg-BG"/>
+          <w14:ligatures w14:val="none"/>
+        </w:rPr>
+        <w:t xml:space="preserve">happy </w:t>
+      </w:r>
+      <w:proofErr w:type="spellStart"/>
+      <w:r>
+        <w:rPr>
+          <w:rFonts w:ascii="Times New Roman" w:eastAsia="Times New Roman" w:hAnsi="Times New Roman" w:cs="Times New Roman"/>
+          <w:kern w:val="0"/>
+          <w:sz w:val="24"/>
+          <w:szCs w:val="24"/>
+          <w:lang w:eastAsia="bg-BG"/>
+          <w14:ligatures w14:val="none"/>
+        </w:rPr>
+        <w:t>with</w:t>
+      </w:r>
+      <w:proofErr w:type="spellEnd"/>
+      <w:r>
+        <w:rPr>
+          <w:rFonts w:ascii="Times New Roman" w:eastAsia="Times New Roman" w:hAnsi="Times New Roman" w:cs="Times New Roman"/>
+          <w:kern w:val="0"/>
+          <w:sz w:val="24"/>
+          <w:szCs w:val="24"/>
+          <w:lang w:eastAsia="bg-BG"/>
+          <w14:ligatures w14:val="none"/>
+        </w:rPr>
+        <w:t xml:space="preserve"> </w:t>
+      </w:r>
+      <w:proofErr w:type="spellStart"/>
+      <w:r>
+        <w:rPr>
+          <w:rFonts w:ascii="Times New Roman" w:eastAsia="Times New Roman" w:hAnsi="Times New Roman" w:cs="Times New Roman"/>
+          <w:kern w:val="0"/>
+          <w:sz w:val="24"/>
+          <w:szCs w:val="24"/>
+          <w:lang w:eastAsia="bg-BG"/>
+          <w14:ligatures w14:val="none"/>
+        </w:rPr>
+        <w:t>the</w:t>
+      </w:r>
+      <w:proofErr w:type="spellEnd"/>
+      <w:r>
+        <w:rPr>
+          <w:rFonts w:ascii="Times New Roman" w:eastAsia="Times New Roman" w:hAnsi="Times New Roman" w:cs="Times New Roman"/>
+          <w:kern w:val="0"/>
+          <w:sz w:val="24"/>
+          <w:szCs w:val="24"/>
+          <w:lang w:eastAsia="bg-BG"/>
+          <w14:ligatures w14:val="none"/>
+        </w:rPr>
+        <w:t xml:space="preserve"> </w:t>
+      </w:r>
+      <w:proofErr w:type="spellStart"/>
+      <w:r>
+        <w:rPr>
+          <w:rFonts w:ascii="Times New Roman" w:eastAsia="Times New Roman" w:hAnsi="Times New Roman" w:cs="Times New Roman"/>
+          <w:kern w:val="0"/>
+          <w:sz w:val="24"/>
+          <w:szCs w:val="24"/>
+          <w:lang w:eastAsia="bg-BG"/>
+          <w14:ligatures w14:val="none"/>
+        </w:rPr>
+        <w:t>progress</w:t>
+      </w:r>
+      <w:proofErr w:type="spellEnd"/>
+      <w:r>
+        <w:rPr>
+          <w:rFonts w:ascii="Times New Roman" w:eastAsia="Times New Roman" w:hAnsi="Times New Roman" w:cs="Times New Roman"/>
+          <w:kern w:val="0"/>
+          <w:sz w:val="24"/>
+          <w:szCs w:val="24"/>
+          <w:lang w:eastAsia="bg-BG"/>
+          <w14:ligatures w14:val="none"/>
+        </w:rPr>
+        <w:t xml:space="preserve"> </w:t>
+      </w:r>
+      <w:proofErr w:type="spellStart"/>
+      <w:r>
+        <w:rPr>
+          <w:rFonts w:ascii="Times New Roman" w:eastAsia="Times New Roman" w:hAnsi="Times New Roman" w:cs="Times New Roman"/>
+          <w:kern w:val="0"/>
+          <w:sz w:val="24"/>
+          <w:szCs w:val="24"/>
+          <w:lang w:eastAsia="bg-BG"/>
+          <w14:ligatures w14:val="none"/>
+        </w:rPr>
+        <w:t>we</w:t>
+      </w:r>
+      <w:proofErr w:type="spellEnd"/>
+      <w:r>
+        <w:rPr>
+          <w:rFonts w:ascii="Times New Roman" w:eastAsia="Times New Roman" w:hAnsi="Times New Roman" w:cs="Times New Roman"/>
+          <w:kern w:val="0"/>
+          <w:sz w:val="24"/>
+          <w:szCs w:val="24"/>
+          <w:lang w:eastAsia="bg-BG"/>
+          <w14:ligatures w14:val="none"/>
+        </w:rPr>
+        <w:t xml:space="preserve"> </w:t>
+      </w:r>
+      <w:proofErr w:type="spellStart"/>
+      <w:r>
+        <w:rPr>
+          <w:rFonts w:ascii="Times New Roman" w:eastAsia="Times New Roman" w:hAnsi="Times New Roman" w:cs="Times New Roman"/>
+          <w:kern w:val="0"/>
+          <w:sz w:val="24"/>
+          <w:szCs w:val="24"/>
+          <w:lang w:eastAsia="bg-BG"/>
+          <w14:ligatures w14:val="none"/>
+        </w:rPr>
+        <w:t>made</w:t>
+      </w:r>
+      <w:proofErr w:type="spellEnd"/>
+      <w:r>
+        <w:rPr>
+          <w:rFonts w:ascii="Times New Roman" w:eastAsia="Times New Roman" w:hAnsi="Times New Roman" w:cs="Times New Roman"/>
+          <w:kern w:val="0"/>
+          <w:sz w:val="24"/>
+          <w:szCs w:val="24"/>
+          <w:lang w:eastAsia="bg-BG"/>
+          <w14:ligatures w14:val="none"/>
+        </w:rPr>
+        <w:t xml:space="preserve"> </w:t>
+      </w:r>
+      <w:proofErr w:type="spellStart"/>
+      <w:r>
+        <w:rPr>
+          <w:rFonts w:ascii="Times New Roman" w:eastAsia="Times New Roman" w:hAnsi="Times New Roman" w:cs="Times New Roman"/>
+          <w:kern w:val="0"/>
+          <w:sz w:val="24"/>
+          <w:szCs w:val="24"/>
+          <w:lang w:eastAsia="bg-BG"/>
+          <w14:ligatures w14:val="none"/>
+        </w:rPr>
+        <w:t>during</w:t>
+      </w:r>
+      <w:proofErr w:type="spellEnd"/>
+      <w:r>
+        <w:rPr>
+          <w:rFonts w:ascii="Times New Roman" w:eastAsia="Times New Roman" w:hAnsi="Times New Roman" w:cs="Times New Roman"/>
+          <w:kern w:val="0"/>
+          <w:sz w:val="24"/>
+          <w:szCs w:val="24"/>
+          <w:lang w:eastAsia="bg-BG"/>
+          <w14:ligatures w14:val="none"/>
+        </w:rPr>
+        <w:t xml:space="preserve"> </w:t>
+      </w:r>
+      <w:proofErr w:type="spellStart"/>
+      <w:r>
+        <w:rPr>
+          <w:rFonts w:ascii="Times New Roman" w:eastAsia="Times New Roman" w:hAnsi="Times New Roman" w:cs="Times New Roman"/>
+          <w:kern w:val="0"/>
+          <w:sz w:val="24"/>
+          <w:szCs w:val="24"/>
+          <w:lang w:eastAsia="bg-BG"/>
+          <w14:ligatures w14:val="none"/>
+        </w:rPr>
+        <w:t>the</w:t>
+      </w:r>
+      <w:proofErr w:type="spellEnd"/>
+      <w:r>
+        <w:rPr>
+          <w:rFonts w:ascii="Times New Roman" w:eastAsia="Times New Roman" w:hAnsi="Times New Roman" w:cs="Times New Roman"/>
+          <w:kern w:val="0"/>
+          <w:sz w:val="24"/>
+          <w:szCs w:val="24"/>
+          <w:lang w:eastAsia="bg-BG"/>
+          <w14:ligatures w14:val="none"/>
+        </w:rPr>
+        <w:t xml:space="preserve"> </w:t>
+      </w:r>
+      <w:proofErr w:type="spellStart"/>
+      <w:r>
+        <w:rPr>
+          <w:rFonts w:ascii="Times New Roman" w:eastAsia="Times New Roman" w:hAnsi="Times New Roman" w:cs="Times New Roman"/>
+          <w:kern w:val="0"/>
+          <w:sz w:val="24"/>
+          <w:szCs w:val="24"/>
+          <w:lang w:eastAsia="bg-BG"/>
+          <w14:ligatures w14:val="none"/>
+        </w:rPr>
+        <w:t>one-month</w:t>
+      </w:r>
+      <w:proofErr w:type="spellEnd"/>
+      <w:r>
+        <w:rPr>
+          <w:rFonts w:ascii="Times New Roman" w:eastAsia="Times New Roman" w:hAnsi="Times New Roman" w:cs="Times New Roman"/>
+          <w:kern w:val="0"/>
+          <w:sz w:val="24"/>
+          <w:szCs w:val="24"/>
+          <w:lang w:eastAsia="bg-BG"/>
+          <w14:ligatures w14:val="none"/>
+        </w:rPr>
+        <w:t xml:space="preserve"> </w:t>
+      </w:r>
+      <w:proofErr w:type="spellStart"/>
+      <w:r>
+        <w:rPr>
+          <w:rFonts w:ascii="Times New Roman" w:eastAsia="Times New Roman" w:hAnsi="Times New Roman" w:cs="Times New Roman"/>
+          <w:kern w:val="0"/>
+          <w:sz w:val="24"/>
+          <w:szCs w:val="24"/>
+          <w:lang w:eastAsia="bg-BG"/>
+          <w14:ligatures w14:val="none"/>
+        </w:rPr>
+        <w:t>period</w:t>
+      </w:r>
+      <w:proofErr w:type="spellEnd"/>
+      <w:r>
+        <w:rPr>
+          <w:rFonts w:ascii="Times New Roman" w:eastAsia="Times New Roman" w:hAnsi="Times New Roman" w:cs="Times New Roman"/>
+          <w:kern w:val="0"/>
+          <w:sz w:val="24"/>
+          <w:szCs w:val="24"/>
+          <w:lang w:eastAsia="bg-BG"/>
+          <w14:ligatures w14:val="none"/>
+        </w:rPr>
+        <w:t xml:space="preserve"> </w:t>
+      </w:r>
+      <w:proofErr w:type="spellStart"/>
+      <w:r>
+        <w:rPr>
+          <w:rFonts w:ascii="Times New Roman" w:eastAsia="Times New Roman" w:hAnsi="Times New Roman" w:cs="Times New Roman"/>
+          <w:kern w:val="0"/>
+          <w:sz w:val="24"/>
+          <w:szCs w:val="24"/>
+          <w:lang w:eastAsia="bg-BG"/>
+          <w14:ligatures w14:val="none"/>
+        </w:rPr>
+        <w:t>we</w:t>
+      </w:r>
+      <w:proofErr w:type="spellEnd"/>
+      <w:r>
+        <w:rPr>
+          <w:rFonts w:ascii="Times New Roman" w:eastAsia="Times New Roman" w:hAnsi="Times New Roman" w:cs="Times New Roman"/>
+          <w:kern w:val="0"/>
+          <w:sz w:val="24"/>
+          <w:szCs w:val="24"/>
+          <w:lang w:eastAsia="bg-BG"/>
+          <w14:ligatures w14:val="none"/>
+        </w:rPr>
+        <w:t xml:space="preserve"> </w:t>
+      </w:r>
+      <w:proofErr w:type="spellStart"/>
+      <w:r>
+        <w:rPr>
+          <w:rFonts w:ascii="Times New Roman" w:eastAsia="Times New Roman" w:hAnsi="Times New Roman" w:cs="Times New Roman"/>
+          <w:kern w:val="0"/>
+          <w:sz w:val="24"/>
+          <w:szCs w:val="24"/>
+          <w:lang w:eastAsia="bg-BG"/>
+          <w14:ligatures w14:val="none"/>
+        </w:rPr>
+        <w:t>had</w:t>
+      </w:r>
+      <w:proofErr w:type="spellEnd"/>
+      <w:r>
+        <w:rPr>
+          <w:rFonts w:ascii="Times New Roman" w:eastAsia="Times New Roman" w:hAnsi="Times New Roman" w:cs="Times New Roman"/>
+          <w:kern w:val="0"/>
+          <w:sz w:val="24"/>
+          <w:szCs w:val="24"/>
+          <w:lang w:eastAsia="bg-BG"/>
+          <w14:ligatures w14:val="none"/>
+        </w:rPr>
+        <w:t xml:space="preserve">. </w:t>
+      </w:r>
+      <w:proofErr w:type="spellStart"/>
+      <w:r>
+        <w:rPr>
+          <w:rFonts w:ascii="Times New Roman" w:eastAsia="Times New Roman" w:hAnsi="Times New Roman" w:cs="Times New Roman"/>
+          <w:kern w:val="0"/>
+          <w:sz w:val="24"/>
+          <w:szCs w:val="24"/>
+          <w:lang w:eastAsia="bg-BG"/>
+          <w14:ligatures w14:val="none"/>
+        </w:rPr>
+        <w:t>However</w:t>
+      </w:r>
+      <w:proofErr w:type="spellEnd"/>
+      <w:r>
+        <w:rPr>
+          <w:rFonts w:ascii="Times New Roman" w:eastAsia="Times New Roman" w:hAnsi="Times New Roman" w:cs="Times New Roman"/>
+          <w:kern w:val="0"/>
+          <w:sz w:val="24"/>
+          <w:szCs w:val="24"/>
+          <w:lang w:eastAsia="bg-BG"/>
+          <w14:ligatures w14:val="none"/>
+        </w:rPr>
+        <w:t xml:space="preserve">, </w:t>
+      </w:r>
+      <w:proofErr w:type="spellStart"/>
+      <w:r>
+        <w:rPr>
+          <w:rFonts w:ascii="Times New Roman" w:eastAsia="Times New Roman" w:hAnsi="Times New Roman" w:cs="Times New Roman"/>
+          <w:kern w:val="0"/>
+          <w:sz w:val="24"/>
+          <w:szCs w:val="24"/>
+          <w:lang w:eastAsia="bg-BG"/>
+          <w14:ligatures w14:val="none"/>
+        </w:rPr>
+        <w:t>we</w:t>
+      </w:r>
+      <w:proofErr w:type="spellEnd"/>
+      <w:r>
+        <w:rPr>
+          <w:rFonts w:ascii="Times New Roman" w:eastAsia="Times New Roman" w:hAnsi="Times New Roman" w:cs="Times New Roman"/>
+          <w:kern w:val="0"/>
+          <w:sz w:val="24"/>
+          <w:szCs w:val="24"/>
+          <w:lang w:eastAsia="bg-BG"/>
+          <w14:ligatures w14:val="none"/>
+        </w:rPr>
+        <w:t xml:space="preserve"> </w:t>
+      </w:r>
+      <w:r>
+        <w:rPr>
+          <w:rFonts w:ascii="Times New Roman" w:eastAsia="Times New Roman" w:hAnsi="Times New Roman" w:cs="Times New Roman"/>
+          <w:kern w:val="0"/>
+          <w:sz w:val="24"/>
+          <w:szCs w:val="24"/>
+          <w:lang w:val="en-US" w:eastAsia="bg-BG"/>
+          <w14:ligatures w14:val="none"/>
+        </w:rPr>
+        <w:t xml:space="preserve">know </w:t>
+      </w:r>
+      <w:proofErr w:type="spellStart"/>
+      <w:r>
+        <w:rPr>
+          <w:rFonts w:ascii="Times New Roman" w:eastAsia="Times New Roman" w:hAnsi="Times New Roman" w:cs="Times New Roman"/>
+          <w:kern w:val="0"/>
+          <w:sz w:val="24"/>
+          <w:szCs w:val="24"/>
+          <w:lang w:eastAsia="bg-BG"/>
+          <w14:ligatures w14:val="none"/>
+        </w:rPr>
+        <w:t>that</w:t>
+      </w:r>
+      <w:proofErr w:type="spellEnd"/>
+      <w:r>
+        <w:rPr>
+          <w:rFonts w:ascii="Times New Roman" w:eastAsia="Times New Roman" w:hAnsi="Times New Roman" w:cs="Times New Roman"/>
+          <w:kern w:val="0"/>
+          <w:sz w:val="24"/>
+          <w:szCs w:val="24"/>
+          <w:lang w:eastAsia="bg-BG"/>
+          <w14:ligatures w14:val="none"/>
+        </w:rPr>
+        <w:t xml:space="preserve"> </w:t>
+      </w:r>
+      <w:proofErr w:type="spellStart"/>
+      <w:r>
+        <w:rPr>
+          <w:rFonts w:ascii="Times New Roman" w:eastAsia="Times New Roman" w:hAnsi="Times New Roman" w:cs="Times New Roman"/>
+          <w:kern w:val="0"/>
+          <w:sz w:val="24"/>
+          <w:szCs w:val="24"/>
+          <w:lang w:eastAsia="bg-BG"/>
+          <w14:ligatures w14:val="none"/>
+        </w:rPr>
+        <w:t>our</w:t>
+      </w:r>
+      <w:proofErr w:type="spellEnd"/>
+      <w:r>
+        <w:rPr>
+          <w:rFonts w:ascii="Times New Roman" w:eastAsia="Times New Roman" w:hAnsi="Times New Roman" w:cs="Times New Roman"/>
+          <w:kern w:val="0"/>
+          <w:sz w:val="24"/>
+          <w:szCs w:val="24"/>
+          <w:lang w:eastAsia="bg-BG"/>
+          <w14:ligatures w14:val="none"/>
+        </w:rPr>
+        <w:t xml:space="preserve"> </w:t>
+      </w:r>
+      <w:proofErr w:type="spellStart"/>
+      <w:r>
+        <w:rPr>
+          <w:rFonts w:ascii="Times New Roman" w:eastAsia="Times New Roman" w:hAnsi="Times New Roman" w:cs="Times New Roman"/>
+          <w:kern w:val="0"/>
+          <w:sz w:val="24"/>
+          <w:szCs w:val="24"/>
+          <w:lang w:eastAsia="bg-BG"/>
+          <w14:ligatures w14:val="none"/>
+        </w:rPr>
+        <w:t>project</w:t>
+      </w:r>
+      <w:proofErr w:type="spellEnd"/>
+      <w:r>
+        <w:rPr>
+          <w:rFonts w:ascii="Times New Roman" w:eastAsia="Times New Roman" w:hAnsi="Times New Roman" w:cs="Times New Roman"/>
+          <w:kern w:val="0"/>
+          <w:sz w:val="24"/>
+          <w:szCs w:val="24"/>
+          <w:lang w:eastAsia="bg-BG"/>
+          <w14:ligatures w14:val="none"/>
+        </w:rPr>
+        <w:t xml:space="preserve"> </w:t>
+      </w:r>
+      <w:proofErr w:type="spellStart"/>
+      <w:r>
+        <w:rPr>
+          <w:rFonts w:ascii="Times New Roman" w:eastAsia="Times New Roman" w:hAnsi="Times New Roman" w:cs="Times New Roman"/>
+          <w:kern w:val="0"/>
+          <w:sz w:val="24"/>
+          <w:szCs w:val="24"/>
+          <w:lang w:eastAsia="bg-BG"/>
+          <w14:ligatures w14:val="none"/>
+        </w:rPr>
+        <w:t>has</w:t>
+      </w:r>
+      <w:proofErr w:type="spellEnd"/>
+      <w:r>
+        <w:rPr>
+          <w:rFonts w:ascii="Times New Roman" w:eastAsia="Times New Roman" w:hAnsi="Times New Roman" w:cs="Times New Roman"/>
+          <w:kern w:val="0"/>
+          <w:sz w:val="24"/>
+          <w:szCs w:val="24"/>
+          <w:lang w:eastAsia="bg-BG"/>
+          <w14:ligatures w14:val="none"/>
+        </w:rPr>
+        <w:t xml:space="preserve"> </w:t>
+      </w:r>
+      <w:proofErr w:type="spellStart"/>
+      <w:r>
+        <w:rPr>
+          <w:rFonts w:ascii="Times New Roman" w:eastAsia="Times New Roman" w:hAnsi="Times New Roman" w:cs="Times New Roman"/>
+          <w:kern w:val="0"/>
+          <w:sz w:val="24"/>
+          <w:szCs w:val="24"/>
+          <w:lang w:eastAsia="bg-BG"/>
+          <w14:ligatures w14:val="none"/>
+        </w:rPr>
+        <w:t>significant</w:t>
+      </w:r>
+      <w:proofErr w:type="spellEnd"/>
+      <w:r>
+        <w:rPr>
+          <w:rFonts w:ascii="Times New Roman" w:eastAsia="Times New Roman" w:hAnsi="Times New Roman" w:cs="Times New Roman"/>
+          <w:kern w:val="0"/>
+          <w:sz w:val="24"/>
+          <w:szCs w:val="24"/>
+          <w:lang w:eastAsia="bg-BG"/>
+          <w14:ligatures w14:val="none"/>
+        </w:rPr>
+        <w:t xml:space="preserve"> </w:t>
+      </w:r>
+      <w:proofErr w:type="spellStart"/>
+      <w:r>
+        <w:rPr>
+          <w:rFonts w:ascii="Times New Roman" w:eastAsia="Times New Roman" w:hAnsi="Times New Roman" w:cs="Times New Roman"/>
+          <w:kern w:val="0"/>
+          <w:sz w:val="24"/>
+          <w:szCs w:val="24"/>
+          <w:lang w:eastAsia="bg-BG"/>
+          <w14:ligatures w14:val="none"/>
+        </w:rPr>
+        <w:t>potential</w:t>
+      </w:r>
+      <w:proofErr w:type="spellEnd"/>
+      <w:r>
+        <w:rPr>
+          <w:rFonts w:ascii="Times New Roman" w:eastAsia="Times New Roman" w:hAnsi="Times New Roman" w:cs="Times New Roman"/>
+          <w:kern w:val="0"/>
+          <w:sz w:val="24"/>
+          <w:szCs w:val="24"/>
+          <w:lang w:eastAsia="bg-BG"/>
+          <w14:ligatures w14:val="none"/>
+        </w:rPr>
+        <w:t xml:space="preserve"> </w:t>
+      </w:r>
+      <w:proofErr w:type="spellStart"/>
+      <w:r>
+        <w:rPr>
+          <w:rFonts w:ascii="Times New Roman" w:eastAsia="Times New Roman" w:hAnsi="Times New Roman" w:cs="Times New Roman"/>
+          <w:kern w:val="0"/>
+          <w:sz w:val="24"/>
+          <w:szCs w:val="24"/>
+          <w:lang w:eastAsia="bg-BG"/>
+          <w14:ligatures w14:val="none"/>
+        </w:rPr>
+        <w:t>for</w:t>
+      </w:r>
+      <w:proofErr w:type="spellEnd"/>
+      <w:r>
+        <w:rPr>
+          <w:rFonts w:ascii="Times New Roman" w:eastAsia="Times New Roman" w:hAnsi="Times New Roman" w:cs="Times New Roman"/>
+          <w:kern w:val="0"/>
+          <w:sz w:val="24"/>
+          <w:szCs w:val="24"/>
+          <w:lang w:eastAsia="bg-BG"/>
+          <w14:ligatures w14:val="none"/>
+        </w:rPr>
+        <w:t xml:space="preserve"> </w:t>
+      </w:r>
+      <w:proofErr w:type="spellStart"/>
+      <w:r>
+        <w:rPr>
+          <w:rFonts w:ascii="Times New Roman" w:eastAsia="Times New Roman" w:hAnsi="Times New Roman" w:cs="Times New Roman"/>
+          <w:kern w:val="0"/>
+          <w:sz w:val="24"/>
+          <w:szCs w:val="24"/>
+          <w:lang w:eastAsia="bg-BG"/>
+          <w14:ligatures w14:val="none"/>
+        </w:rPr>
+        <w:t>further</w:t>
+      </w:r>
+      <w:proofErr w:type="spellEnd"/>
+      <w:r>
+        <w:rPr>
+          <w:rFonts w:ascii="Times New Roman" w:eastAsia="Times New Roman" w:hAnsi="Times New Roman" w:cs="Times New Roman"/>
+          <w:kern w:val="0"/>
+          <w:sz w:val="24"/>
+          <w:szCs w:val="24"/>
+          <w:lang w:eastAsia="bg-BG"/>
+          <w14:ligatures w14:val="none"/>
+        </w:rPr>
+        <w:t xml:space="preserve"> </w:t>
+      </w:r>
+      <w:proofErr w:type="spellStart"/>
+      <w:r>
+        <w:rPr>
+          <w:rFonts w:ascii="Times New Roman" w:eastAsia="Times New Roman" w:hAnsi="Times New Roman" w:cs="Times New Roman"/>
+          <w:kern w:val="0"/>
+          <w:sz w:val="24"/>
+          <w:szCs w:val="24"/>
+          <w:lang w:eastAsia="bg-BG"/>
+          <w14:ligatures w14:val="none"/>
+        </w:rPr>
+        <w:t>development</w:t>
+      </w:r>
+      <w:proofErr w:type="spellEnd"/>
+      <w:r>
+        <w:rPr>
+          <w:rFonts w:ascii="Times New Roman" w:eastAsia="Times New Roman" w:hAnsi="Times New Roman" w:cs="Times New Roman"/>
+          <w:kern w:val="0"/>
+          <w:sz w:val="24"/>
+          <w:szCs w:val="24"/>
+          <w:lang w:eastAsia="bg-BG"/>
+          <w14:ligatures w14:val="none"/>
+        </w:rPr>
+        <w:t xml:space="preserve">. </w:t>
+      </w:r>
+      <w:proofErr w:type="spellStart"/>
+      <w:r>
+        <w:rPr>
+          <w:rFonts w:ascii="Times New Roman" w:eastAsia="Times New Roman" w:hAnsi="Times New Roman" w:cs="Times New Roman"/>
+          <w:kern w:val="0"/>
+          <w:sz w:val="24"/>
+          <w:szCs w:val="24"/>
+          <w:lang w:eastAsia="bg-BG"/>
+          <w14:ligatures w14:val="none"/>
+        </w:rPr>
+        <w:t>Moving</w:t>
+      </w:r>
+      <w:proofErr w:type="spellEnd"/>
+      <w:r>
+        <w:rPr>
+          <w:rFonts w:ascii="Times New Roman" w:eastAsia="Times New Roman" w:hAnsi="Times New Roman" w:cs="Times New Roman"/>
+          <w:kern w:val="0"/>
+          <w:sz w:val="24"/>
+          <w:szCs w:val="24"/>
+          <w:lang w:eastAsia="bg-BG"/>
+          <w14:ligatures w14:val="none"/>
+        </w:rPr>
+        <w:t xml:space="preserve"> </w:t>
+      </w:r>
+      <w:proofErr w:type="spellStart"/>
+      <w:r>
+        <w:rPr>
+          <w:rFonts w:ascii="Times New Roman" w:eastAsia="Times New Roman" w:hAnsi="Times New Roman" w:cs="Times New Roman"/>
+          <w:kern w:val="0"/>
+          <w:sz w:val="24"/>
+          <w:szCs w:val="24"/>
+          <w:lang w:eastAsia="bg-BG"/>
+          <w14:ligatures w14:val="none"/>
+        </w:rPr>
+        <w:t>forward</w:t>
+      </w:r>
+      <w:proofErr w:type="spellEnd"/>
+      <w:r>
+        <w:rPr>
+          <w:rFonts w:ascii="Times New Roman" w:eastAsia="Times New Roman" w:hAnsi="Times New Roman" w:cs="Times New Roman"/>
+          <w:kern w:val="0"/>
+          <w:sz w:val="24"/>
+          <w:szCs w:val="24"/>
+          <w:lang w:eastAsia="bg-BG"/>
+          <w14:ligatures w14:val="none"/>
+        </w:rPr>
+        <w:t xml:space="preserve">, </w:t>
+      </w:r>
+      <w:proofErr w:type="spellStart"/>
+      <w:r>
+        <w:rPr>
+          <w:rFonts w:ascii="Times New Roman" w:eastAsia="Times New Roman" w:hAnsi="Times New Roman" w:cs="Times New Roman"/>
+          <w:kern w:val="0"/>
+          <w:sz w:val="24"/>
+          <w:szCs w:val="24"/>
+          <w:lang w:eastAsia="bg-BG"/>
+          <w14:ligatures w14:val="none"/>
+        </w:rPr>
+        <w:t>we</w:t>
+      </w:r>
+      <w:proofErr w:type="spellEnd"/>
+      <w:r>
+        <w:rPr>
+          <w:rFonts w:ascii="Times New Roman" w:eastAsia="Times New Roman" w:hAnsi="Times New Roman" w:cs="Times New Roman"/>
+          <w:kern w:val="0"/>
+          <w:sz w:val="24"/>
+          <w:szCs w:val="24"/>
+          <w:lang w:eastAsia="bg-BG"/>
+          <w14:ligatures w14:val="none"/>
+        </w:rPr>
+        <w:t xml:space="preserve"> </w:t>
+      </w:r>
+      <w:proofErr w:type="spellStart"/>
+      <w:r>
+        <w:rPr>
+          <w:rFonts w:ascii="Times New Roman" w:eastAsia="Times New Roman" w:hAnsi="Times New Roman" w:cs="Times New Roman"/>
+          <w:kern w:val="0"/>
+          <w:sz w:val="24"/>
+          <w:szCs w:val="24"/>
+          <w:lang w:eastAsia="bg-BG"/>
+          <w14:ligatures w14:val="none"/>
+        </w:rPr>
+        <w:t>aim</w:t>
+      </w:r>
+      <w:proofErr w:type="spellEnd"/>
+      <w:r>
+        <w:rPr>
+          <w:rFonts w:ascii="Times New Roman" w:eastAsia="Times New Roman" w:hAnsi="Times New Roman" w:cs="Times New Roman"/>
+          <w:kern w:val="0"/>
+          <w:sz w:val="24"/>
+          <w:szCs w:val="24"/>
+          <w:lang w:eastAsia="bg-BG"/>
+          <w14:ligatures w14:val="none"/>
+        </w:rPr>
+        <w:t xml:space="preserve"> </w:t>
+      </w:r>
+      <w:proofErr w:type="spellStart"/>
+      <w:r>
+        <w:rPr>
+          <w:rFonts w:ascii="Times New Roman" w:eastAsia="Times New Roman" w:hAnsi="Times New Roman" w:cs="Times New Roman"/>
+          <w:kern w:val="0"/>
+          <w:sz w:val="24"/>
+          <w:szCs w:val="24"/>
+          <w:lang w:eastAsia="bg-BG"/>
+          <w14:ligatures w14:val="none"/>
+        </w:rPr>
+        <w:t>to</w:t>
+      </w:r>
+      <w:proofErr w:type="spellEnd"/>
+      <w:r>
+        <w:rPr>
+          <w:rFonts w:ascii="Times New Roman" w:eastAsia="Times New Roman" w:hAnsi="Times New Roman" w:cs="Times New Roman"/>
+          <w:kern w:val="0"/>
+          <w:sz w:val="24"/>
+          <w:szCs w:val="24"/>
+          <w:lang w:eastAsia="bg-BG"/>
+          <w14:ligatures w14:val="none"/>
+        </w:rPr>
+        <w:t xml:space="preserve"> </w:t>
+      </w:r>
+      <w:proofErr w:type="spellStart"/>
+      <w:r>
+        <w:rPr>
+          <w:rFonts w:ascii="Times New Roman" w:eastAsia="Times New Roman" w:hAnsi="Times New Roman" w:cs="Times New Roman"/>
+          <w:kern w:val="0"/>
+          <w:sz w:val="24"/>
+          <w:szCs w:val="24"/>
+          <w:lang w:eastAsia="bg-BG"/>
+          <w14:ligatures w14:val="none"/>
+        </w:rPr>
+        <w:t>integrate</w:t>
+      </w:r>
+      <w:proofErr w:type="spellEnd"/>
+      <w:r>
+        <w:rPr>
+          <w:rFonts w:ascii="Times New Roman" w:eastAsia="Times New Roman" w:hAnsi="Times New Roman" w:cs="Times New Roman"/>
+          <w:kern w:val="0"/>
+          <w:sz w:val="24"/>
+          <w:szCs w:val="24"/>
+          <w:lang w:eastAsia="bg-BG"/>
+          <w14:ligatures w14:val="none"/>
+        </w:rPr>
+        <w:t xml:space="preserve"> </w:t>
+      </w:r>
+      <w:proofErr w:type="spellStart"/>
+      <w:r>
+        <w:rPr>
+          <w:rFonts w:ascii="Times New Roman" w:eastAsia="Times New Roman" w:hAnsi="Times New Roman" w:cs="Times New Roman"/>
+          <w:kern w:val="0"/>
+          <w:sz w:val="24"/>
+          <w:szCs w:val="24"/>
+          <w:lang w:eastAsia="bg-BG"/>
+          <w14:ligatures w14:val="none"/>
         </w:rPr>
         <w:t>databases</w:t>
       </w:r>
-      <w:r>
-        <w:rPr>
-          <w:rFonts w:ascii="Poppins" w:hAnsi="Poppins" w:cs="Poppins"/>
-          <w:sz w:val="24"/>
-          <w:szCs w:val="24"/>
-          <w:lang w:val="en-US"/>
-        </w:rPr>
-        <w:t xml:space="preserve"> to save results and progress and we also want to add more assignments and lessons for the future and  to add the opinion </w:t>
-      </w:r>
-      <w:r>
-        <w:rPr>
-          <w:rFonts w:ascii="Poppins" w:hAnsi="Poppins" w:cs="Poppins"/>
-          <w:sz w:val="24"/>
-          <w:szCs w:val="24"/>
-          <w:lang w:val="en-US"/>
-        </w:rPr>
-        <w:lastRenderedPageBreak/>
-        <w:t xml:space="preserve">to choose your grade and look at the lessons and assignments that you have. </w:t>
-      </w:r>
+      <w:proofErr w:type="spellEnd"/>
+      <w:r>
+        <w:rPr>
+          <w:rFonts w:ascii="Times New Roman" w:eastAsia="Times New Roman" w:hAnsi="Times New Roman" w:cs="Times New Roman"/>
+          <w:kern w:val="0"/>
+          <w:sz w:val="24"/>
+          <w:szCs w:val="24"/>
+          <w:lang w:eastAsia="bg-BG"/>
+          <w14:ligatures w14:val="none"/>
+        </w:rPr>
+        <w:t xml:space="preserve"> </w:t>
+      </w:r>
+      <w:proofErr w:type="spellStart"/>
+      <w:r>
+        <w:rPr>
+          <w:rFonts w:ascii="Times New Roman" w:eastAsia="Times New Roman" w:hAnsi="Times New Roman" w:cs="Times New Roman"/>
+          <w:kern w:val="0"/>
+          <w:sz w:val="24"/>
+          <w:szCs w:val="24"/>
+          <w:lang w:eastAsia="bg-BG"/>
+          <w14:ligatures w14:val="none"/>
+        </w:rPr>
+        <w:t>to</w:t>
+      </w:r>
+      <w:proofErr w:type="spellEnd"/>
+      <w:r>
+        <w:rPr>
+          <w:rFonts w:ascii="Times New Roman" w:eastAsia="Times New Roman" w:hAnsi="Times New Roman" w:cs="Times New Roman"/>
+          <w:kern w:val="0"/>
+          <w:sz w:val="24"/>
+          <w:szCs w:val="24"/>
+          <w:lang w:eastAsia="bg-BG"/>
+          <w14:ligatures w14:val="none"/>
+        </w:rPr>
+        <w:t xml:space="preserve"> </w:t>
+      </w:r>
+      <w:proofErr w:type="spellStart"/>
+      <w:r>
+        <w:rPr>
+          <w:rFonts w:ascii="Times New Roman" w:eastAsia="Times New Roman" w:hAnsi="Times New Roman" w:cs="Times New Roman"/>
+          <w:kern w:val="0"/>
+          <w:sz w:val="24"/>
+          <w:szCs w:val="24"/>
+          <w:lang w:eastAsia="bg-BG"/>
+          <w14:ligatures w14:val="none"/>
+        </w:rPr>
+        <w:t>store</w:t>
+      </w:r>
+      <w:proofErr w:type="spellEnd"/>
+      <w:r>
+        <w:rPr>
+          <w:rFonts w:ascii="Times New Roman" w:eastAsia="Times New Roman" w:hAnsi="Times New Roman" w:cs="Times New Roman"/>
+          <w:kern w:val="0"/>
+          <w:sz w:val="24"/>
+          <w:szCs w:val="24"/>
+          <w:lang w:eastAsia="bg-BG"/>
+          <w14:ligatures w14:val="none"/>
+        </w:rPr>
+        <w:t xml:space="preserve"> </w:t>
+      </w:r>
+      <w:proofErr w:type="spellStart"/>
+      <w:r>
+        <w:rPr>
+          <w:rFonts w:ascii="Times New Roman" w:eastAsia="Times New Roman" w:hAnsi="Times New Roman" w:cs="Times New Roman"/>
+          <w:kern w:val="0"/>
+          <w:sz w:val="24"/>
+          <w:szCs w:val="24"/>
+          <w:lang w:eastAsia="bg-BG"/>
+          <w14:ligatures w14:val="none"/>
+        </w:rPr>
+        <w:t>results</w:t>
+      </w:r>
+      <w:proofErr w:type="spellEnd"/>
+      <w:r>
+        <w:rPr>
+          <w:rFonts w:ascii="Times New Roman" w:eastAsia="Times New Roman" w:hAnsi="Times New Roman" w:cs="Times New Roman"/>
+          <w:kern w:val="0"/>
+          <w:sz w:val="24"/>
+          <w:szCs w:val="24"/>
+          <w:lang w:eastAsia="bg-BG"/>
+          <w14:ligatures w14:val="none"/>
+        </w:rPr>
+        <w:t xml:space="preserve"> </w:t>
+      </w:r>
+      <w:proofErr w:type="spellStart"/>
+      <w:r>
+        <w:rPr>
+          <w:rFonts w:ascii="Times New Roman" w:eastAsia="Times New Roman" w:hAnsi="Times New Roman" w:cs="Times New Roman"/>
+          <w:kern w:val="0"/>
+          <w:sz w:val="24"/>
+          <w:szCs w:val="24"/>
+          <w:lang w:eastAsia="bg-BG"/>
+          <w14:ligatures w14:val="none"/>
+        </w:rPr>
+        <w:t>and</w:t>
+      </w:r>
+      <w:proofErr w:type="spellEnd"/>
+      <w:r>
+        <w:rPr>
+          <w:rFonts w:ascii="Times New Roman" w:eastAsia="Times New Roman" w:hAnsi="Times New Roman" w:cs="Times New Roman"/>
+          <w:kern w:val="0"/>
+          <w:sz w:val="24"/>
+          <w:szCs w:val="24"/>
+          <w:lang w:eastAsia="bg-BG"/>
+          <w14:ligatures w14:val="none"/>
+        </w:rPr>
+        <w:t xml:space="preserve"> </w:t>
+      </w:r>
+      <w:proofErr w:type="spellStart"/>
+      <w:r>
+        <w:rPr>
+          <w:rFonts w:ascii="Times New Roman" w:eastAsia="Times New Roman" w:hAnsi="Times New Roman" w:cs="Times New Roman"/>
+          <w:kern w:val="0"/>
+          <w:sz w:val="24"/>
+          <w:szCs w:val="24"/>
+          <w:lang w:eastAsia="bg-BG"/>
+          <w14:ligatures w14:val="none"/>
+        </w:rPr>
+        <w:t>track</w:t>
+      </w:r>
+      <w:proofErr w:type="spellEnd"/>
+      <w:r>
+        <w:rPr>
+          <w:rFonts w:ascii="Times New Roman" w:eastAsia="Times New Roman" w:hAnsi="Times New Roman" w:cs="Times New Roman"/>
+          <w:kern w:val="0"/>
+          <w:sz w:val="24"/>
+          <w:szCs w:val="24"/>
+          <w:lang w:eastAsia="bg-BG"/>
+          <w14:ligatures w14:val="none"/>
+        </w:rPr>
+        <w:t xml:space="preserve"> </w:t>
+      </w:r>
+      <w:proofErr w:type="spellStart"/>
+      <w:r>
+        <w:rPr>
+          <w:rFonts w:ascii="Times New Roman" w:eastAsia="Times New Roman" w:hAnsi="Times New Roman" w:cs="Times New Roman"/>
+          <w:kern w:val="0"/>
+          <w:sz w:val="24"/>
+          <w:szCs w:val="24"/>
+          <w:lang w:eastAsia="bg-BG"/>
+          <w14:ligatures w14:val="none"/>
+        </w:rPr>
+        <w:t>user</w:t>
+      </w:r>
+      <w:proofErr w:type="spellEnd"/>
+      <w:r>
+        <w:rPr>
+          <w:rFonts w:ascii="Times New Roman" w:eastAsia="Times New Roman" w:hAnsi="Times New Roman" w:cs="Times New Roman"/>
+          <w:kern w:val="0"/>
+          <w:sz w:val="24"/>
+          <w:szCs w:val="24"/>
+          <w:lang w:eastAsia="bg-BG"/>
+          <w14:ligatures w14:val="none"/>
+        </w:rPr>
+        <w:t xml:space="preserve"> </w:t>
+      </w:r>
+      <w:proofErr w:type="spellStart"/>
+      <w:r>
+        <w:rPr>
+          <w:rFonts w:ascii="Times New Roman" w:eastAsia="Times New Roman" w:hAnsi="Times New Roman" w:cs="Times New Roman"/>
+          <w:kern w:val="0"/>
+          <w:sz w:val="24"/>
+          <w:szCs w:val="24"/>
+          <w:lang w:eastAsia="bg-BG"/>
+          <w14:ligatures w14:val="none"/>
+        </w:rPr>
+        <w:t>progress</w:t>
+      </w:r>
+      <w:proofErr w:type="spellEnd"/>
+      <w:r>
+        <w:rPr>
+          <w:rFonts w:ascii="Times New Roman" w:eastAsia="Times New Roman" w:hAnsi="Times New Roman" w:cs="Times New Roman"/>
+          <w:kern w:val="0"/>
+          <w:sz w:val="24"/>
+          <w:szCs w:val="24"/>
+          <w:lang w:eastAsia="bg-BG"/>
+          <w14:ligatures w14:val="none"/>
+        </w:rPr>
+        <w:t xml:space="preserve"> </w:t>
+      </w:r>
+      <w:proofErr w:type="spellStart"/>
+      <w:r>
+        <w:rPr>
+          <w:rFonts w:ascii="Times New Roman" w:eastAsia="Times New Roman" w:hAnsi="Times New Roman" w:cs="Times New Roman"/>
+          <w:kern w:val="0"/>
+          <w:sz w:val="24"/>
+          <w:szCs w:val="24"/>
+          <w:lang w:eastAsia="bg-BG"/>
+          <w14:ligatures w14:val="none"/>
+        </w:rPr>
+        <w:t>efficiently</w:t>
+      </w:r>
+      <w:proofErr w:type="spellEnd"/>
+      <w:r>
+        <w:rPr>
+          <w:rFonts w:ascii="Times New Roman" w:eastAsia="Times New Roman" w:hAnsi="Times New Roman" w:cs="Times New Roman"/>
+          <w:kern w:val="0"/>
+          <w:sz w:val="24"/>
+          <w:szCs w:val="24"/>
+          <w:lang w:eastAsia="bg-BG"/>
+          <w14:ligatures w14:val="none"/>
+        </w:rPr>
+        <w:t xml:space="preserve">. </w:t>
+      </w:r>
+      <w:proofErr w:type="spellStart"/>
+      <w:r>
+        <w:rPr>
+          <w:rFonts w:ascii="Times New Roman" w:eastAsia="Times New Roman" w:hAnsi="Times New Roman" w:cs="Times New Roman"/>
+          <w:kern w:val="0"/>
+          <w:sz w:val="24"/>
+          <w:szCs w:val="24"/>
+          <w:lang w:eastAsia="bg-BG"/>
+          <w14:ligatures w14:val="none"/>
+        </w:rPr>
+        <w:t>Additionally</w:t>
+      </w:r>
+      <w:proofErr w:type="spellEnd"/>
+      <w:r>
+        <w:rPr>
+          <w:rFonts w:ascii="Times New Roman" w:eastAsia="Times New Roman" w:hAnsi="Times New Roman" w:cs="Times New Roman"/>
+          <w:kern w:val="0"/>
+          <w:sz w:val="24"/>
+          <w:szCs w:val="24"/>
+          <w:lang w:eastAsia="bg-BG"/>
+          <w14:ligatures w14:val="none"/>
+        </w:rPr>
+        <w:t xml:space="preserve">, </w:t>
+      </w:r>
+      <w:proofErr w:type="spellStart"/>
+      <w:r>
+        <w:rPr>
+          <w:rFonts w:ascii="Times New Roman" w:eastAsia="Times New Roman" w:hAnsi="Times New Roman" w:cs="Times New Roman"/>
+          <w:kern w:val="0"/>
+          <w:sz w:val="24"/>
+          <w:szCs w:val="24"/>
+          <w:lang w:eastAsia="bg-BG"/>
+          <w14:ligatures w14:val="none"/>
+        </w:rPr>
+        <w:t>we</w:t>
+      </w:r>
+      <w:proofErr w:type="spellEnd"/>
+      <w:r>
+        <w:rPr>
+          <w:rFonts w:ascii="Times New Roman" w:eastAsia="Times New Roman" w:hAnsi="Times New Roman" w:cs="Times New Roman"/>
+          <w:kern w:val="0"/>
+          <w:sz w:val="24"/>
+          <w:szCs w:val="24"/>
+          <w:lang w:eastAsia="bg-BG"/>
+          <w14:ligatures w14:val="none"/>
+        </w:rPr>
+        <w:t xml:space="preserve"> </w:t>
+      </w:r>
+      <w:proofErr w:type="spellStart"/>
+      <w:r>
+        <w:rPr>
+          <w:rFonts w:ascii="Times New Roman" w:eastAsia="Times New Roman" w:hAnsi="Times New Roman" w:cs="Times New Roman"/>
+          <w:kern w:val="0"/>
+          <w:sz w:val="24"/>
+          <w:szCs w:val="24"/>
+          <w:lang w:eastAsia="bg-BG"/>
+          <w14:ligatures w14:val="none"/>
+        </w:rPr>
+        <w:t>plan</w:t>
+      </w:r>
+      <w:proofErr w:type="spellEnd"/>
+      <w:r>
+        <w:rPr>
+          <w:rFonts w:ascii="Times New Roman" w:eastAsia="Times New Roman" w:hAnsi="Times New Roman" w:cs="Times New Roman"/>
+          <w:kern w:val="0"/>
+          <w:sz w:val="24"/>
+          <w:szCs w:val="24"/>
+          <w:lang w:eastAsia="bg-BG"/>
+          <w14:ligatures w14:val="none"/>
+        </w:rPr>
+        <w:t xml:space="preserve"> </w:t>
+      </w:r>
+      <w:proofErr w:type="spellStart"/>
+      <w:r>
+        <w:rPr>
+          <w:rFonts w:ascii="Times New Roman" w:eastAsia="Times New Roman" w:hAnsi="Times New Roman" w:cs="Times New Roman"/>
+          <w:kern w:val="0"/>
+          <w:sz w:val="24"/>
+          <w:szCs w:val="24"/>
+          <w:lang w:eastAsia="bg-BG"/>
+          <w14:ligatures w14:val="none"/>
+        </w:rPr>
+        <w:t>to</w:t>
+      </w:r>
+      <w:proofErr w:type="spellEnd"/>
+      <w:r>
+        <w:rPr>
+          <w:rFonts w:ascii="Times New Roman" w:eastAsia="Times New Roman" w:hAnsi="Times New Roman" w:cs="Times New Roman"/>
+          <w:kern w:val="0"/>
+          <w:sz w:val="24"/>
+          <w:szCs w:val="24"/>
+          <w:lang w:eastAsia="bg-BG"/>
+          <w14:ligatures w14:val="none"/>
+        </w:rPr>
+        <w:t xml:space="preserve"> </w:t>
+      </w:r>
+      <w:proofErr w:type="spellStart"/>
+      <w:r>
+        <w:rPr>
+          <w:rFonts w:ascii="Times New Roman" w:eastAsia="Times New Roman" w:hAnsi="Times New Roman" w:cs="Times New Roman"/>
+          <w:kern w:val="0"/>
+          <w:sz w:val="24"/>
+          <w:szCs w:val="24"/>
+          <w:lang w:eastAsia="bg-BG"/>
+          <w14:ligatures w14:val="none"/>
+        </w:rPr>
+        <w:t>expand</w:t>
+      </w:r>
+      <w:proofErr w:type="spellEnd"/>
+      <w:r>
+        <w:rPr>
+          <w:rFonts w:ascii="Times New Roman" w:eastAsia="Times New Roman" w:hAnsi="Times New Roman" w:cs="Times New Roman"/>
+          <w:kern w:val="0"/>
+          <w:sz w:val="24"/>
+          <w:szCs w:val="24"/>
+          <w:lang w:eastAsia="bg-BG"/>
+          <w14:ligatures w14:val="none"/>
+        </w:rPr>
+        <w:t xml:space="preserve"> </w:t>
+      </w:r>
+      <w:proofErr w:type="spellStart"/>
+      <w:r>
+        <w:rPr>
+          <w:rFonts w:ascii="Times New Roman" w:eastAsia="Times New Roman" w:hAnsi="Times New Roman" w:cs="Times New Roman"/>
+          <w:kern w:val="0"/>
+          <w:sz w:val="24"/>
+          <w:szCs w:val="24"/>
+          <w:lang w:eastAsia="bg-BG"/>
+          <w14:ligatures w14:val="none"/>
+        </w:rPr>
+        <w:t>the</w:t>
+      </w:r>
+      <w:proofErr w:type="spellEnd"/>
+      <w:r>
+        <w:rPr>
+          <w:rFonts w:ascii="Times New Roman" w:eastAsia="Times New Roman" w:hAnsi="Times New Roman" w:cs="Times New Roman"/>
+          <w:kern w:val="0"/>
+          <w:sz w:val="24"/>
+          <w:szCs w:val="24"/>
+          <w:lang w:eastAsia="bg-BG"/>
+          <w14:ligatures w14:val="none"/>
+        </w:rPr>
+        <w:t xml:space="preserve"> </w:t>
+      </w:r>
+      <w:proofErr w:type="spellStart"/>
+      <w:r>
+        <w:rPr>
+          <w:rFonts w:ascii="Times New Roman" w:eastAsia="Times New Roman" w:hAnsi="Times New Roman" w:cs="Times New Roman"/>
+          <w:kern w:val="0"/>
+          <w:sz w:val="24"/>
+          <w:szCs w:val="24"/>
+          <w:lang w:eastAsia="bg-BG"/>
+          <w14:ligatures w14:val="none"/>
+        </w:rPr>
+        <w:t>platform</w:t>
+      </w:r>
+      <w:proofErr w:type="spellEnd"/>
+      <w:r>
+        <w:rPr>
+          <w:rFonts w:ascii="Times New Roman" w:eastAsia="Times New Roman" w:hAnsi="Times New Roman" w:cs="Times New Roman"/>
+          <w:kern w:val="0"/>
+          <w:sz w:val="24"/>
+          <w:szCs w:val="24"/>
+          <w:lang w:eastAsia="bg-BG"/>
+          <w14:ligatures w14:val="none"/>
+        </w:rPr>
+        <w:t xml:space="preserve"> </w:t>
+      </w:r>
+      <w:proofErr w:type="spellStart"/>
+      <w:r>
+        <w:rPr>
+          <w:rFonts w:ascii="Times New Roman" w:eastAsia="Times New Roman" w:hAnsi="Times New Roman" w:cs="Times New Roman"/>
+          <w:kern w:val="0"/>
+          <w:sz w:val="24"/>
+          <w:szCs w:val="24"/>
+          <w:lang w:eastAsia="bg-BG"/>
+          <w14:ligatures w14:val="none"/>
+        </w:rPr>
+        <w:t>by</w:t>
+      </w:r>
+      <w:proofErr w:type="spellEnd"/>
+      <w:r>
+        <w:rPr>
+          <w:rFonts w:ascii="Times New Roman" w:eastAsia="Times New Roman" w:hAnsi="Times New Roman" w:cs="Times New Roman"/>
+          <w:kern w:val="0"/>
+          <w:sz w:val="24"/>
+          <w:szCs w:val="24"/>
+          <w:lang w:eastAsia="bg-BG"/>
+          <w14:ligatures w14:val="none"/>
+        </w:rPr>
+        <w:t xml:space="preserve"> </w:t>
+      </w:r>
+      <w:proofErr w:type="spellStart"/>
+      <w:r>
+        <w:rPr>
+          <w:rFonts w:ascii="Times New Roman" w:eastAsia="Times New Roman" w:hAnsi="Times New Roman" w:cs="Times New Roman"/>
+          <w:kern w:val="0"/>
+          <w:sz w:val="24"/>
+          <w:szCs w:val="24"/>
+          <w:lang w:eastAsia="bg-BG"/>
+          <w14:ligatures w14:val="none"/>
+        </w:rPr>
+        <w:t>incorporating</w:t>
+      </w:r>
+      <w:proofErr w:type="spellEnd"/>
+      <w:r>
+        <w:rPr>
+          <w:rFonts w:ascii="Times New Roman" w:eastAsia="Times New Roman" w:hAnsi="Times New Roman" w:cs="Times New Roman"/>
+          <w:kern w:val="0"/>
+          <w:sz w:val="24"/>
+          <w:szCs w:val="24"/>
+          <w:lang w:eastAsia="bg-BG"/>
+          <w14:ligatures w14:val="none"/>
+        </w:rPr>
+        <w:t xml:space="preserve"> </w:t>
+      </w:r>
+      <w:proofErr w:type="spellStart"/>
+      <w:r>
+        <w:rPr>
+          <w:rFonts w:ascii="Times New Roman" w:eastAsia="Times New Roman" w:hAnsi="Times New Roman" w:cs="Times New Roman"/>
+          <w:kern w:val="0"/>
+          <w:sz w:val="24"/>
+          <w:szCs w:val="24"/>
+          <w:lang w:eastAsia="bg-BG"/>
+          <w14:ligatures w14:val="none"/>
+        </w:rPr>
+        <w:t>more</w:t>
+      </w:r>
+      <w:proofErr w:type="spellEnd"/>
+      <w:r>
+        <w:rPr>
+          <w:rFonts w:ascii="Times New Roman" w:eastAsia="Times New Roman" w:hAnsi="Times New Roman" w:cs="Times New Roman"/>
+          <w:kern w:val="0"/>
+          <w:sz w:val="24"/>
+          <w:szCs w:val="24"/>
+          <w:lang w:eastAsia="bg-BG"/>
+          <w14:ligatures w14:val="none"/>
+        </w:rPr>
+        <w:t xml:space="preserve"> </w:t>
+      </w:r>
+      <w:proofErr w:type="spellStart"/>
+      <w:r>
+        <w:rPr>
+          <w:rFonts w:ascii="Times New Roman" w:eastAsia="Times New Roman" w:hAnsi="Times New Roman" w:cs="Times New Roman"/>
+          <w:kern w:val="0"/>
+          <w:sz w:val="24"/>
+          <w:szCs w:val="24"/>
+          <w:lang w:eastAsia="bg-BG"/>
+          <w14:ligatures w14:val="none"/>
+        </w:rPr>
+        <w:t>assignments</w:t>
+      </w:r>
+      <w:proofErr w:type="spellEnd"/>
+      <w:r>
+        <w:rPr>
+          <w:rFonts w:ascii="Times New Roman" w:eastAsia="Times New Roman" w:hAnsi="Times New Roman" w:cs="Times New Roman"/>
+          <w:kern w:val="0"/>
+          <w:sz w:val="24"/>
+          <w:szCs w:val="24"/>
+          <w:lang w:eastAsia="bg-BG"/>
+          <w14:ligatures w14:val="none"/>
+        </w:rPr>
+        <w:t xml:space="preserve"> </w:t>
+      </w:r>
+      <w:proofErr w:type="spellStart"/>
+      <w:r>
+        <w:rPr>
+          <w:rFonts w:ascii="Times New Roman" w:eastAsia="Times New Roman" w:hAnsi="Times New Roman" w:cs="Times New Roman"/>
+          <w:kern w:val="0"/>
+          <w:sz w:val="24"/>
+          <w:szCs w:val="24"/>
+          <w:lang w:eastAsia="bg-BG"/>
+          <w14:ligatures w14:val="none"/>
+        </w:rPr>
+        <w:t>and</w:t>
+      </w:r>
+      <w:proofErr w:type="spellEnd"/>
+      <w:r>
+        <w:rPr>
+          <w:rFonts w:ascii="Times New Roman" w:eastAsia="Times New Roman" w:hAnsi="Times New Roman" w:cs="Times New Roman"/>
+          <w:kern w:val="0"/>
+          <w:sz w:val="24"/>
+          <w:szCs w:val="24"/>
+          <w:lang w:eastAsia="bg-BG"/>
+          <w14:ligatures w14:val="none"/>
+        </w:rPr>
+        <w:t xml:space="preserve"> </w:t>
+      </w:r>
+      <w:proofErr w:type="spellStart"/>
+      <w:r>
+        <w:rPr>
+          <w:rFonts w:ascii="Times New Roman" w:eastAsia="Times New Roman" w:hAnsi="Times New Roman" w:cs="Times New Roman"/>
+          <w:kern w:val="0"/>
+          <w:sz w:val="24"/>
+          <w:szCs w:val="24"/>
+          <w:lang w:eastAsia="bg-BG"/>
+          <w14:ligatures w14:val="none"/>
+        </w:rPr>
+        <w:t>lessons</w:t>
+      </w:r>
+      <w:proofErr w:type="spellEnd"/>
+      <w:r>
+        <w:rPr>
+          <w:rFonts w:ascii="Times New Roman" w:eastAsia="Times New Roman" w:hAnsi="Times New Roman" w:cs="Times New Roman"/>
+          <w:kern w:val="0"/>
+          <w:sz w:val="24"/>
+          <w:szCs w:val="24"/>
+          <w:lang w:eastAsia="bg-BG"/>
+          <w14:ligatures w14:val="none"/>
+        </w:rPr>
+        <w:t xml:space="preserve">. </w:t>
+      </w:r>
+      <w:proofErr w:type="spellStart"/>
+      <w:r>
+        <w:rPr>
+          <w:rFonts w:ascii="Times New Roman" w:eastAsia="Times New Roman" w:hAnsi="Times New Roman" w:cs="Times New Roman"/>
+          <w:kern w:val="0"/>
+          <w:sz w:val="24"/>
+          <w:szCs w:val="24"/>
+          <w:lang w:eastAsia="bg-BG"/>
+          <w14:ligatures w14:val="none"/>
+        </w:rPr>
+        <w:t>We</w:t>
+      </w:r>
+      <w:proofErr w:type="spellEnd"/>
+      <w:r>
+        <w:rPr>
+          <w:rFonts w:ascii="Times New Roman" w:eastAsia="Times New Roman" w:hAnsi="Times New Roman" w:cs="Times New Roman"/>
+          <w:kern w:val="0"/>
+          <w:sz w:val="24"/>
+          <w:szCs w:val="24"/>
+          <w:lang w:eastAsia="bg-BG"/>
+          <w14:ligatures w14:val="none"/>
+        </w:rPr>
+        <w:t xml:space="preserve"> </w:t>
+      </w:r>
+      <w:proofErr w:type="spellStart"/>
+      <w:r>
+        <w:rPr>
+          <w:rFonts w:ascii="Times New Roman" w:eastAsia="Times New Roman" w:hAnsi="Times New Roman" w:cs="Times New Roman"/>
+          <w:kern w:val="0"/>
+          <w:sz w:val="24"/>
+          <w:szCs w:val="24"/>
+          <w:lang w:eastAsia="bg-BG"/>
+          <w14:ligatures w14:val="none"/>
+        </w:rPr>
+        <w:t>also</w:t>
+      </w:r>
+      <w:proofErr w:type="spellEnd"/>
+      <w:r>
+        <w:rPr>
+          <w:rFonts w:ascii="Times New Roman" w:eastAsia="Times New Roman" w:hAnsi="Times New Roman" w:cs="Times New Roman"/>
+          <w:kern w:val="0"/>
+          <w:sz w:val="24"/>
+          <w:szCs w:val="24"/>
+          <w:lang w:eastAsia="bg-BG"/>
+          <w14:ligatures w14:val="none"/>
+        </w:rPr>
+        <w:t xml:space="preserve"> </w:t>
+      </w:r>
+      <w:proofErr w:type="spellStart"/>
+      <w:r>
+        <w:rPr>
+          <w:rFonts w:ascii="Times New Roman" w:eastAsia="Times New Roman" w:hAnsi="Times New Roman" w:cs="Times New Roman"/>
+          <w:kern w:val="0"/>
+          <w:sz w:val="24"/>
+          <w:szCs w:val="24"/>
+          <w:lang w:eastAsia="bg-BG"/>
+          <w14:ligatures w14:val="none"/>
+        </w:rPr>
+        <w:t>intend</w:t>
+      </w:r>
+      <w:proofErr w:type="spellEnd"/>
+      <w:r>
+        <w:rPr>
+          <w:rFonts w:ascii="Times New Roman" w:eastAsia="Times New Roman" w:hAnsi="Times New Roman" w:cs="Times New Roman"/>
+          <w:kern w:val="0"/>
+          <w:sz w:val="24"/>
+          <w:szCs w:val="24"/>
+          <w:lang w:eastAsia="bg-BG"/>
+          <w14:ligatures w14:val="none"/>
+        </w:rPr>
+        <w:t xml:space="preserve"> </w:t>
+      </w:r>
+      <w:proofErr w:type="spellStart"/>
+      <w:r>
+        <w:rPr>
+          <w:rFonts w:ascii="Times New Roman" w:eastAsia="Times New Roman" w:hAnsi="Times New Roman" w:cs="Times New Roman"/>
+          <w:kern w:val="0"/>
+          <w:sz w:val="24"/>
+          <w:szCs w:val="24"/>
+          <w:lang w:eastAsia="bg-BG"/>
+          <w14:ligatures w14:val="none"/>
+        </w:rPr>
+        <w:t>to</w:t>
+      </w:r>
+      <w:proofErr w:type="spellEnd"/>
+      <w:r>
+        <w:rPr>
+          <w:rFonts w:ascii="Times New Roman" w:eastAsia="Times New Roman" w:hAnsi="Times New Roman" w:cs="Times New Roman"/>
+          <w:kern w:val="0"/>
+          <w:sz w:val="24"/>
+          <w:szCs w:val="24"/>
+          <w:lang w:eastAsia="bg-BG"/>
+          <w14:ligatures w14:val="none"/>
+        </w:rPr>
+        <w:t xml:space="preserve"> </w:t>
+      </w:r>
+      <w:proofErr w:type="spellStart"/>
+      <w:r>
+        <w:rPr>
+          <w:rFonts w:ascii="Times New Roman" w:eastAsia="Times New Roman" w:hAnsi="Times New Roman" w:cs="Times New Roman"/>
+          <w:kern w:val="0"/>
+          <w:sz w:val="24"/>
+          <w:szCs w:val="24"/>
+          <w:lang w:eastAsia="bg-BG"/>
+          <w14:ligatures w14:val="none"/>
+        </w:rPr>
+        <w:t>implement</w:t>
+      </w:r>
+      <w:proofErr w:type="spellEnd"/>
+      <w:r>
+        <w:rPr>
+          <w:rFonts w:ascii="Times New Roman" w:eastAsia="Times New Roman" w:hAnsi="Times New Roman" w:cs="Times New Roman"/>
+          <w:kern w:val="0"/>
+          <w:sz w:val="24"/>
+          <w:szCs w:val="24"/>
+          <w:lang w:eastAsia="bg-BG"/>
+          <w14:ligatures w14:val="none"/>
+        </w:rPr>
+        <w:t xml:space="preserve"> a </w:t>
+      </w:r>
+      <w:proofErr w:type="spellStart"/>
+      <w:r>
+        <w:rPr>
+          <w:rFonts w:ascii="Times New Roman" w:eastAsia="Times New Roman" w:hAnsi="Times New Roman" w:cs="Times New Roman"/>
+          <w:kern w:val="0"/>
+          <w:sz w:val="24"/>
+          <w:szCs w:val="24"/>
+          <w:lang w:eastAsia="bg-BG"/>
+          <w14:ligatures w14:val="none"/>
+        </w:rPr>
+        <w:t>feature</w:t>
+      </w:r>
+      <w:proofErr w:type="spellEnd"/>
+      <w:r>
+        <w:rPr>
+          <w:rFonts w:ascii="Times New Roman" w:eastAsia="Times New Roman" w:hAnsi="Times New Roman" w:cs="Times New Roman"/>
+          <w:kern w:val="0"/>
+          <w:sz w:val="24"/>
+          <w:szCs w:val="24"/>
+          <w:lang w:eastAsia="bg-BG"/>
+          <w14:ligatures w14:val="none"/>
+        </w:rPr>
+        <w:t xml:space="preserve"> </w:t>
+      </w:r>
+      <w:proofErr w:type="spellStart"/>
+      <w:r>
+        <w:rPr>
+          <w:rFonts w:ascii="Times New Roman" w:eastAsia="Times New Roman" w:hAnsi="Times New Roman" w:cs="Times New Roman"/>
+          <w:kern w:val="0"/>
+          <w:sz w:val="24"/>
+          <w:szCs w:val="24"/>
+          <w:lang w:eastAsia="bg-BG"/>
+          <w14:ligatures w14:val="none"/>
+        </w:rPr>
+        <w:t>that</w:t>
+      </w:r>
+      <w:proofErr w:type="spellEnd"/>
+      <w:r>
+        <w:rPr>
+          <w:rFonts w:ascii="Times New Roman" w:eastAsia="Times New Roman" w:hAnsi="Times New Roman" w:cs="Times New Roman"/>
+          <w:kern w:val="0"/>
+          <w:sz w:val="24"/>
+          <w:szCs w:val="24"/>
+          <w:lang w:eastAsia="bg-BG"/>
+          <w14:ligatures w14:val="none"/>
+        </w:rPr>
+        <w:t xml:space="preserve"> </w:t>
+      </w:r>
+      <w:proofErr w:type="spellStart"/>
+      <w:r>
+        <w:rPr>
+          <w:rFonts w:ascii="Times New Roman" w:eastAsia="Times New Roman" w:hAnsi="Times New Roman" w:cs="Times New Roman"/>
+          <w:kern w:val="0"/>
+          <w:sz w:val="24"/>
+          <w:szCs w:val="24"/>
+          <w:lang w:eastAsia="bg-BG"/>
+          <w14:ligatures w14:val="none"/>
+        </w:rPr>
+        <w:t>allows</w:t>
+      </w:r>
+      <w:proofErr w:type="spellEnd"/>
+      <w:r>
+        <w:rPr>
+          <w:rFonts w:ascii="Times New Roman" w:eastAsia="Times New Roman" w:hAnsi="Times New Roman" w:cs="Times New Roman"/>
+          <w:kern w:val="0"/>
+          <w:sz w:val="24"/>
+          <w:szCs w:val="24"/>
+          <w:lang w:eastAsia="bg-BG"/>
+          <w14:ligatures w14:val="none"/>
+        </w:rPr>
+        <w:t xml:space="preserve"> </w:t>
+      </w:r>
+      <w:proofErr w:type="spellStart"/>
+      <w:r>
+        <w:rPr>
+          <w:rFonts w:ascii="Times New Roman" w:eastAsia="Times New Roman" w:hAnsi="Times New Roman" w:cs="Times New Roman"/>
+          <w:kern w:val="0"/>
+          <w:sz w:val="24"/>
+          <w:szCs w:val="24"/>
+          <w:lang w:eastAsia="bg-BG"/>
+          <w14:ligatures w14:val="none"/>
+        </w:rPr>
+        <w:t>users</w:t>
+      </w:r>
+      <w:proofErr w:type="spellEnd"/>
+      <w:r>
+        <w:rPr>
+          <w:rFonts w:ascii="Times New Roman" w:eastAsia="Times New Roman" w:hAnsi="Times New Roman" w:cs="Times New Roman"/>
+          <w:kern w:val="0"/>
+          <w:sz w:val="24"/>
+          <w:szCs w:val="24"/>
+          <w:lang w:eastAsia="bg-BG"/>
+          <w14:ligatures w14:val="none"/>
+        </w:rPr>
+        <w:t xml:space="preserve"> </w:t>
+      </w:r>
+      <w:proofErr w:type="spellStart"/>
+      <w:r>
+        <w:rPr>
+          <w:rFonts w:ascii="Times New Roman" w:eastAsia="Times New Roman" w:hAnsi="Times New Roman" w:cs="Times New Roman"/>
+          <w:kern w:val="0"/>
+          <w:sz w:val="24"/>
+          <w:szCs w:val="24"/>
+          <w:lang w:eastAsia="bg-BG"/>
+          <w14:ligatures w14:val="none"/>
+        </w:rPr>
+        <w:t>to</w:t>
+      </w:r>
+      <w:proofErr w:type="spellEnd"/>
+      <w:r>
+        <w:rPr>
+          <w:rFonts w:ascii="Times New Roman" w:eastAsia="Times New Roman" w:hAnsi="Times New Roman" w:cs="Times New Roman"/>
+          <w:kern w:val="0"/>
+          <w:sz w:val="24"/>
+          <w:szCs w:val="24"/>
+          <w:lang w:eastAsia="bg-BG"/>
+          <w14:ligatures w14:val="none"/>
+        </w:rPr>
+        <w:t xml:space="preserve"> </w:t>
+      </w:r>
+      <w:proofErr w:type="spellStart"/>
+      <w:r>
+        <w:rPr>
+          <w:rFonts w:ascii="Times New Roman" w:eastAsia="Times New Roman" w:hAnsi="Times New Roman" w:cs="Times New Roman"/>
+          <w:kern w:val="0"/>
+          <w:sz w:val="24"/>
+          <w:szCs w:val="24"/>
+          <w:lang w:eastAsia="bg-BG"/>
+          <w14:ligatures w14:val="none"/>
+        </w:rPr>
+        <w:t>select</w:t>
+      </w:r>
+      <w:proofErr w:type="spellEnd"/>
+      <w:r>
+        <w:rPr>
+          <w:rFonts w:ascii="Times New Roman" w:eastAsia="Times New Roman" w:hAnsi="Times New Roman" w:cs="Times New Roman"/>
+          <w:kern w:val="0"/>
+          <w:sz w:val="24"/>
+          <w:szCs w:val="24"/>
+          <w:lang w:eastAsia="bg-BG"/>
+          <w14:ligatures w14:val="none"/>
+        </w:rPr>
+        <w:t xml:space="preserve"> </w:t>
+      </w:r>
+      <w:proofErr w:type="spellStart"/>
+      <w:r>
+        <w:rPr>
+          <w:rFonts w:ascii="Times New Roman" w:eastAsia="Times New Roman" w:hAnsi="Times New Roman" w:cs="Times New Roman"/>
+          <w:kern w:val="0"/>
+          <w:sz w:val="24"/>
+          <w:szCs w:val="24"/>
+          <w:lang w:eastAsia="bg-BG"/>
+          <w14:ligatures w14:val="none"/>
+        </w:rPr>
+        <w:t>their</w:t>
+      </w:r>
+      <w:proofErr w:type="spellEnd"/>
+      <w:r>
+        <w:rPr>
+          <w:rFonts w:ascii="Times New Roman" w:eastAsia="Times New Roman" w:hAnsi="Times New Roman" w:cs="Times New Roman"/>
+          <w:kern w:val="0"/>
+          <w:sz w:val="24"/>
+          <w:szCs w:val="24"/>
+          <w:lang w:eastAsia="bg-BG"/>
+          <w14:ligatures w14:val="none"/>
+        </w:rPr>
+        <w:t xml:space="preserve"> </w:t>
+      </w:r>
+      <w:proofErr w:type="spellStart"/>
+      <w:r>
+        <w:rPr>
+          <w:rFonts w:ascii="Times New Roman" w:eastAsia="Times New Roman" w:hAnsi="Times New Roman" w:cs="Times New Roman"/>
+          <w:kern w:val="0"/>
+          <w:sz w:val="24"/>
+          <w:szCs w:val="24"/>
+          <w:lang w:eastAsia="bg-BG"/>
+          <w14:ligatures w14:val="none"/>
+        </w:rPr>
+        <w:t>grade</w:t>
+      </w:r>
+      <w:proofErr w:type="spellEnd"/>
+      <w:r>
+        <w:rPr>
+          <w:rFonts w:ascii="Times New Roman" w:eastAsia="Times New Roman" w:hAnsi="Times New Roman" w:cs="Times New Roman"/>
+          <w:kern w:val="0"/>
+          <w:sz w:val="24"/>
+          <w:szCs w:val="24"/>
+          <w:lang w:eastAsia="bg-BG"/>
+          <w14:ligatures w14:val="none"/>
+        </w:rPr>
+        <w:t xml:space="preserve"> </w:t>
+      </w:r>
+      <w:proofErr w:type="spellStart"/>
+      <w:r>
+        <w:rPr>
+          <w:rFonts w:ascii="Times New Roman" w:eastAsia="Times New Roman" w:hAnsi="Times New Roman" w:cs="Times New Roman"/>
+          <w:kern w:val="0"/>
+          <w:sz w:val="24"/>
+          <w:szCs w:val="24"/>
+          <w:lang w:eastAsia="bg-BG"/>
+          <w14:ligatures w14:val="none"/>
+        </w:rPr>
+        <w:t>level</w:t>
+      </w:r>
+      <w:proofErr w:type="spellEnd"/>
+      <w:r>
+        <w:rPr>
+          <w:rFonts w:ascii="Times New Roman" w:eastAsia="Times New Roman" w:hAnsi="Times New Roman" w:cs="Times New Roman"/>
+          <w:kern w:val="0"/>
+          <w:sz w:val="24"/>
+          <w:szCs w:val="24"/>
+          <w:lang w:eastAsia="bg-BG"/>
+          <w14:ligatures w14:val="none"/>
+        </w:rPr>
+        <w:t xml:space="preserve"> </w:t>
+      </w:r>
+      <w:proofErr w:type="spellStart"/>
+      <w:r>
+        <w:rPr>
+          <w:rFonts w:ascii="Times New Roman" w:eastAsia="Times New Roman" w:hAnsi="Times New Roman" w:cs="Times New Roman"/>
+          <w:kern w:val="0"/>
+          <w:sz w:val="24"/>
+          <w:szCs w:val="24"/>
+          <w:lang w:eastAsia="bg-BG"/>
+          <w14:ligatures w14:val="none"/>
+        </w:rPr>
+        <w:t>and</w:t>
+      </w:r>
+      <w:proofErr w:type="spellEnd"/>
+      <w:r>
+        <w:rPr>
+          <w:rFonts w:ascii="Times New Roman" w:eastAsia="Times New Roman" w:hAnsi="Times New Roman" w:cs="Times New Roman"/>
+          <w:kern w:val="0"/>
+          <w:sz w:val="24"/>
+          <w:szCs w:val="24"/>
+          <w:lang w:eastAsia="bg-BG"/>
+          <w14:ligatures w14:val="none"/>
+        </w:rPr>
+        <w:t xml:space="preserve"> </w:t>
+      </w:r>
+      <w:proofErr w:type="spellStart"/>
+      <w:r>
+        <w:rPr>
+          <w:rFonts w:ascii="Times New Roman" w:eastAsia="Times New Roman" w:hAnsi="Times New Roman" w:cs="Times New Roman"/>
+          <w:kern w:val="0"/>
+          <w:sz w:val="24"/>
+          <w:szCs w:val="24"/>
+          <w:lang w:eastAsia="bg-BG"/>
+          <w14:ligatures w14:val="none"/>
+        </w:rPr>
+        <w:t>access</w:t>
+      </w:r>
+      <w:proofErr w:type="spellEnd"/>
+      <w:r>
+        <w:rPr>
+          <w:rFonts w:ascii="Times New Roman" w:eastAsia="Times New Roman" w:hAnsi="Times New Roman" w:cs="Times New Roman"/>
+          <w:kern w:val="0"/>
+          <w:sz w:val="24"/>
+          <w:szCs w:val="24"/>
+          <w:lang w:eastAsia="bg-BG"/>
+          <w14:ligatures w14:val="none"/>
+        </w:rPr>
+        <w:t xml:space="preserve"> </w:t>
+      </w:r>
+      <w:proofErr w:type="spellStart"/>
+      <w:r>
+        <w:rPr>
+          <w:rFonts w:ascii="Times New Roman" w:eastAsia="Times New Roman" w:hAnsi="Times New Roman" w:cs="Times New Roman"/>
+          <w:kern w:val="0"/>
+          <w:sz w:val="24"/>
+          <w:szCs w:val="24"/>
+          <w:lang w:eastAsia="bg-BG"/>
+          <w14:ligatures w14:val="none"/>
+        </w:rPr>
+        <w:t>relevant</w:t>
+      </w:r>
+      <w:proofErr w:type="spellEnd"/>
+      <w:r>
+        <w:rPr>
+          <w:rFonts w:ascii="Times New Roman" w:eastAsia="Times New Roman" w:hAnsi="Times New Roman" w:cs="Times New Roman"/>
+          <w:kern w:val="0"/>
+          <w:sz w:val="24"/>
+          <w:szCs w:val="24"/>
+          <w:lang w:eastAsia="bg-BG"/>
+          <w14:ligatures w14:val="none"/>
+        </w:rPr>
+        <w:t xml:space="preserve"> </w:t>
+      </w:r>
+      <w:proofErr w:type="spellStart"/>
+      <w:r>
+        <w:rPr>
+          <w:rFonts w:ascii="Times New Roman" w:eastAsia="Times New Roman" w:hAnsi="Times New Roman" w:cs="Times New Roman"/>
+          <w:kern w:val="0"/>
+          <w:sz w:val="24"/>
+          <w:szCs w:val="24"/>
+          <w:lang w:eastAsia="bg-BG"/>
+          <w14:ligatures w14:val="none"/>
+        </w:rPr>
+        <w:t>lessons</w:t>
+      </w:r>
+      <w:proofErr w:type="spellEnd"/>
+      <w:r>
+        <w:rPr>
+          <w:rFonts w:ascii="Times New Roman" w:eastAsia="Times New Roman" w:hAnsi="Times New Roman" w:cs="Times New Roman"/>
+          <w:kern w:val="0"/>
+          <w:sz w:val="24"/>
+          <w:szCs w:val="24"/>
+          <w:lang w:eastAsia="bg-BG"/>
+          <w14:ligatures w14:val="none"/>
+        </w:rPr>
+        <w:t xml:space="preserve"> </w:t>
+      </w:r>
+      <w:proofErr w:type="spellStart"/>
+      <w:r>
+        <w:rPr>
+          <w:rFonts w:ascii="Times New Roman" w:eastAsia="Times New Roman" w:hAnsi="Times New Roman" w:cs="Times New Roman"/>
+          <w:kern w:val="0"/>
+          <w:sz w:val="24"/>
+          <w:szCs w:val="24"/>
+          <w:lang w:eastAsia="bg-BG"/>
+          <w14:ligatures w14:val="none"/>
+        </w:rPr>
+        <w:t>and</w:t>
+      </w:r>
+      <w:proofErr w:type="spellEnd"/>
+      <w:r>
+        <w:rPr>
+          <w:rFonts w:ascii="Times New Roman" w:eastAsia="Times New Roman" w:hAnsi="Times New Roman" w:cs="Times New Roman"/>
+          <w:kern w:val="0"/>
+          <w:sz w:val="24"/>
+          <w:szCs w:val="24"/>
+          <w:lang w:eastAsia="bg-BG"/>
+          <w14:ligatures w14:val="none"/>
+        </w:rPr>
+        <w:t xml:space="preserve"> </w:t>
+      </w:r>
+      <w:proofErr w:type="spellStart"/>
+      <w:r>
+        <w:rPr>
+          <w:rFonts w:ascii="Times New Roman" w:eastAsia="Times New Roman" w:hAnsi="Times New Roman" w:cs="Times New Roman"/>
+          <w:kern w:val="0"/>
+          <w:sz w:val="24"/>
+          <w:szCs w:val="24"/>
+          <w:lang w:eastAsia="bg-BG"/>
+          <w14:ligatures w14:val="none"/>
+        </w:rPr>
+        <w:t>assignments</w:t>
+      </w:r>
+      <w:proofErr w:type="spellEnd"/>
+      <w:r>
+        <w:rPr>
+          <w:rFonts w:ascii="Times New Roman" w:eastAsia="Times New Roman" w:hAnsi="Times New Roman" w:cs="Times New Roman"/>
+          <w:kern w:val="0"/>
+          <w:sz w:val="24"/>
+          <w:szCs w:val="24"/>
+          <w:lang w:eastAsia="bg-BG"/>
+          <w14:ligatures w14:val="none"/>
+        </w:rPr>
+        <w:t xml:space="preserve"> </w:t>
+      </w:r>
+      <w:proofErr w:type="spellStart"/>
+      <w:r>
+        <w:rPr>
+          <w:rFonts w:ascii="Times New Roman" w:eastAsia="Times New Roman" w:hAnsi="Times New Roman" w:cs="Times New Roman"/>
+          <w:kern w:val="0"/>
+          <w:sz w:val="24"/>
+          <w:szCs w:val="24"/>
+          <w:lang w:eastAsia="bg-BG"/>
+          <w14:ligatures w14:val="none"/>
+        </w:rPr>
+        <w:t>accordingly</w:t>
+      </w:r>
+      <w:proofErr w:type="spellEnd"/>
+      <w:r>
+        <w:rPr>
+          <w:rFonts w:ascii="Times New Roman" w:eastAsia="Times New Roman" w:hAnsi="Times New Roman" w:cs="Times New Roman"/>
+          <w:kern w:val="0"/>
+          <w:sz w:val="24"/>
+          <w:szCs w:val="24"/>
+          <w:lang w:eastAsia="bg-BG"/>
+          <w14:ligatures w14:val="none"/>
+        </w:rPr>
+        <w:t xml:space="preserve">. </w:t>
+      </w:r>
+      <w:proofErr w:type="spellStart"/>
+      <w:r>
+        <w:rPr>
+          <w:rFonts w:ascii="Times New Roman" w:eastAsia="Times New Roman" w:hAnsi="Times New Roman" w:cs="Times New Roman"/>
+          <w:kern w:val="0"/>
+          <w:sz w:val="24"/>
+          <w:szCs w:val="24"/>
+          <w:lang w:eastAsia="bg-BG"/>
+          <w14:ligatures w14:val="none"/>
+        </w:rPr>
+        <w:t>These</w:t>
+      </w:r>
+      <w:proofErr w:type="spellEnd"/>
+      <w:r>
+        <w:rPr>
+          <w:rFonts w:ascii="Times New Roman" w:eastAsia="Times New Roman" w:hAnsi="Times New Roman" w:cs="Times New Roman"/>
+          <w:kern w:val="0"/>
+          <w:sz w:val="24"/>
+          <w:szCs w:val="24"/>
+          <w:lang w:eastAsia="bg-BG"/>
+          <w14:ligatures w14:val="none"/>
+        </w:rPr>
+        <w:t xml:space="preserve"> </w:t>
+      </w:r>
+      <w:proofErr w:type="spellStart"/>
+      <w:r>
+        <w:rPr>
+          <w:rFonts w:ascii="Times New Roman" w:eastAsia="Times New Roman" w:hAnsi="Times New Roman" w:cs="Times New Roman"/>
+          <w:kern w:val="0"/>
+          <w:sz w:val="24"/>
+          <w:szCs w:val="24"/>
+          <w:lang w:eastAsia="bg-BG"/>
+          <w14:ligatures w14:val="none"/>
+        </w:rPr>
+        <w:t>enhancements</w:t>
+      </w:r>
+      <w:proofErr w:type="spellEnd"/>
+      <w:r>
+        <w:rPr>
+          <w:rFonts w:ascii="Times New Roman" w:eastAsia="Times New Roman" w:hAnsi="Times New Roman" w:cs="Times New Roman"/>
+          <w:kern w:val="0"/>
+          <w:sz w:val="24"/>
+          <w:szCs w:val="24"/>
+          <w:lang w:eastAsia="bg-BG"/>
+          <w14:ligatures w14:val="none"/>
+        </w:rPr>
+        <w:t xml:space="preserve"> </w:t>
+      </w:r>
+      <w:proofErr w:type="spellStart"/>
+      <w:r>
+        <w:rPr>
+          <w:rFonts w:ascii="Times New Roman" w:eastAsia="Times New Roman" w:hAnsi="Times New Roman" w:cs="Times New Roman"/>
+          <w:kern w:val="0"/>
+          <w:sz w:val="24"/>
+          <w:szCs w:val="24"/>
+          <w:lang w:eastAsia="bg-BG"/>
+          <w14:ligatures w14:val="none"/>
+        </w:rPr>
+        <w:t>will</w:t>
+      </w:r>
+      <w:proofErr w:type="spellEnd"/>
+      <w:r>
+        <w:rPr>
+          <w:rFonts w:ascii="Times New Roman" w:eastAsia="Times New Roman" w:hAnsi="Times New Roman" w:cs="Times New Roman"/>
+          <w:kern w:val="0"/>
+          <w:sz w:val="24"/>
+          <w:szCs w:val="24"/>
+          <w:lang w:eastAsia="bg-BG"/>
+          <w14:ligatures w14:val="none"/>
+        </w:rPr>
+        <w:t xml:space="preserve"> </w:t>
+      </w:r>
+      <w:proofErr w:type="spellStart"/>
+      <w:r>
+        <w:rPr>
+          <w:rFonts w:ascii="Times New Roman" w:eastAsia="Times New Roman" w:hAnsi="Times New Roman" w:cs="Times New Roman"/>
+          <w:kern w:val="0"/>
+          <w:sz w:val="24"/>
+          <w:szCs w:val="24"/>
+          <w:lang w:eastAsia="bg-BG"/>
+          <w14:ligatures w14:val="none"/>
+        </w:rPr>
+        <w:t>improve</w:t>
+      </w:r>
+      <w:proofErr w:type="spellEnd"/>
+      <w:r>
+        <w:rPr>
+          <w:rFonts w:ascii="Times New Roman" w:eastAsia="Times New Roman" w:hAnsi="Times New Roman" w:cs="Times New Roman"/>
+          <w:kern w:val="0"/>
+          <w:sz w:val="24"/>
+          <w:szCs w:val="24"/>
+          <w:lang w:eastAsia="bg-BG"/>
+          <w14:ligatures w14:val="none"/>
+        </w:rPr>
+        <w:t xml:space="preserve"> </w:t>
+      </w:r>
+      <w:proofErr w:type="spellStart"/>
+      <w:r>
+        <w:rPr>
+          <w:rFonts w:ascii="Times New Roman" w:eastAsia="Times New Roman" w:hAnsi="Times New Roman" w:cs="Times New Roman"/>
+          <w:kern w:val="0"/>
+          <w:sz w:val="24"/>
+          <w:szCs w:val="24"/>
+          <w:lang w:eastAsia="bg-BG"/>
+          <w14:ligatures w14:val="none"/>
+        </w:rPr>
+        <w:t>the</w:t>
+      </w:r>
+      <w:proofErr w:type="spellEnd"/>
+      <w:r>
+        <w:rPr>
+          <w:rFonts w:ascii="Times New Roman" w:eastAsia="Times New Roman" w:hAnsi="Times New Roman" w:cs="Times New Roman"/>
+          <w:kern w:val="0"/>
+          <w:sz w:val="24"/>
+          <w:szCs w:val="24"/>
+          <w:lang w:eastAsia="bg-BG"/>
+          <w14:ligatures w14:val="none"/>
+        </w:rPr>
+        <w:t xml:space="preserve"> </w:t>
+      </w:r>
+      <w:proofErr w:type="spellStart"/>
+      <w:r>
+        <w:rPr>
+          <w:rFonts w:ascii="Times New Roman" w:eastAsia="Times New Roman" w:hAnsi="Times New Roman" w:cs="Times New Roman"/>
+          <w:kern w:val="0"/>
+          <w:sz w:val="24"/>
+          <w:szCs w:val="24"/>
+          <w:lang w:eastAsia="bg-BG"/>
+          <w14:ligatures w14:val="none"/>
+        </w:rPr>
+        <w:t>overall</w:t>
+      </w:r>
+      <w:proofErr w:type="spellEnd"/>
+      <w:r>
+        <w:rPr>
+          <w:rFonts w:ascii="Times New Roman" w:eastAsia="Times New Roman" w:hAnsi="Times New Roman" w:cs="Times New Roman"/>
+          <w:kern w:val="0"/>
+          <w:sz w:val="24"/>
+          <w:szCs w:val="24"/>
+          <w:lang w:eastAsia="bg-BG"/>
+          <w14:ligatures w14:val="none"/>
+        </w:rPr>
+        <w:t xml:space="preserve"> </w:t>
+      </w:r>
+      <w:proofErr w:type="spellStart"/>
+      <w:r>
+        <w:rPr>
+          <w:rFonts w:ascii="Times New Roman" w:eastAsia="Times New Roman" w:hAnsi="Times New Roman" w:cs="Times New Roman"/>
+          <w:kern w:val="0"/>
+          <w:sz w:val="24"/>
+          <w:szCs w:val="24"/>
+          <w:lang w:eastAsia="bg-BG"/>
+          <w14:ligatures w14:val="none"/>
+        </w:rPr>
+        <w:t>functionality</w:t>
+      </w:r>
+      <w:proofErr w:type="spellEnd"/>
+      <w:r>
+        <w:rPr>
+          <w:rFonts w:ascii="Times New Roman" w:eastAsia="Times New Roman" w:hAnsi="Times New Roman" w:cs="Times New Roman"/>
+          <w:kern w:val="0"/>
+          <w:sz w:val="24"/>
+          <w:szCs w:val="24"/>
+          <w:lang w:eastAsia="bg-BG"/>
+          <w14:ligatures w14:val="none"/>
+        </w:rPr>
+        <w:t xml:space="preserve"> </w:t>
+      </w:r>
+      <w:proofErr w:type="spellStart"/>
+      <w:r>
+        <w:rPr>
+          <w:rFonts w:ascii="Times New Roman" w:eastAsia="Times New Roman" w:hAnsi="Times New Roman" w:cs="Times New Roman"/>
+          <w:kern w:val="0"/>
+          <w:sz w:val="24"/>
+          <w:szCs w:val="24"/>
+          <w:lang w:eastAsia="bg-BG"/>
+          <w14:ligatures w14:val="none"/>
+        </w:rPr>
+        <w:t>and</w:t>
+      </w:r>
+      <w:proofErr w:type="spellEnd"/>
+      <w:r>
+        <w:rPr>
+          <w:rFonts w:ascii="Times New Roman" w:eastAsia="Times New Roman" w:hAnsi="Times New Roman" w:cs="Times New Roman"/>
+          <w:kern w:val="0"/>
+          <w:sz w:val="24"/>
+          <w:szCs w:val="24"/>
+          <w:lang w:eastAsia="bg-BG"/>
+          <w14:ligatures w14:val="none"/>
+        </w:rPr>
+        <w:t xml:space="preserve"> </w:t>
+      </w:r>
+      <w:proofErr w:type="spellStart"/>
+      <w:r>
+        <w:rPr>
+          <w:rFonts w:ascii="Times New Roman" w:eastAsia="Times New Roman" w:hAnsi="Times New Roman" w:cs="Times New Roman"/>
+          <w:kern w:val="0"/>
+          <w:sz w:val="24"/>
+          <w:szCs w:val="24"/>
+          <w:lang w:eastAsia="bg-BG"/>
+          <w14:ligatures w14:val="none"/>
+        </w:rPr>
+        <w:t>user</w:t>
+      </w:r>
+      <w:proofErr w:type="spellEnd"/>
+      <w:r>
+        <w:rPr>
+          <w:rFonts w:ascii="Times New Roman" w:eastAsia="Times New Roman" w:hAnsi="Times New Roman" w:cs="Times New Roman"/>
+          <w:kern w:val="0"/>
+          <w:sz w:val="24"/>
+          <w:szCs w:val="24"/>
+          <w:lang w:eastAsia="bg-BG"/>
+          <w14:ligatures w14:val="none"/>
+        </w:rPr>
+        <w:t xml:space="preserve"> </w:t>
+      </w:r>
+      <w:proofErr w:type="spellStart"/>
+      <w:r>
+        <w:rPr>
+          <w:rFonts w:ascii="Times New Roman" w:eastAsia="Times New Roman" w:hAnsi="Times New Roman" w:cs="Times New Roman"/>
+          <w:kern w:val="0"/>
+          <w:sz w:val="24"/>
+          <w:szCs w:val="24"/>
+          <w:lang w:eastAsia="bg-BG"/>
+          <w14:ligatures w14:val="none"/>
+        </w:rPr>
+        <w:t>experience</w:t>
+      </w:r>
+      <w:proofErr w:type="spellEnd"/>
+      <w:r>
+        <w:rPr>
+          <w:rFonts w:ascii="Times New Roman" w:eastAsia="Times New Roman" w:hAnsi="Times New Roman" w:cs="Times New Roman"/>
+          <w:kern w:val="0"/>
+          <w:sz w:val="24"/>
+          <w:szCs w:val="24"/>
+          <w:lang w:eastAsia="bg-BG"/>
+          <w14:ligatures w14:val="none"/>
+        </w:rPr>
+        <w:t xml:space="preserve"> </w:t>
+      </w:r>
+      <w:proofErr w:type="spellStart"/>
+      <w:r>
+        <w:rPr>
+          <w:rFonts w:ascii="Times New Roman" w:eastAsia="Times New Roman" w:hAnsi="Times New Roman" w:cs="Times New Roman"/>
+          <w:kern w:val="0"/>
+          <w:sz w:val="24"/>
+          <w:szCs w:val="24"/>
+          <w:lang w:eastAsia="bg-BG"/>
+          <w14:ligatures w14:val="none"/>
+        </w:rPr>
+        <w:t>of</w:t>
+      </w:r>
+      <w:proofErr w:type="spellEnd"/>
+      <w:r>
+        <w:rPr>
+          <w:rFonts w:ascii="Times New Roman" w:eastAsia="Times New Roman" w:hAnsi="Times New Roman" w:cs="Times New Roman"/>
+          <w:kern w:val="0"/>
+          <w:sz w:val="24"/>
+          <w:szCs w:val="24"/>
+          <w:lang w:eastAsia="bg-BG"/>
+          <w14:ligatures w14:val="none"/>
+        </w:rPr>
+        <w:t xml:space="preserve"> </w:t>
+      </w:r>
+      <w:proofErr w:type="spellStart"/>
+      <w:r>
+        <w:rPr>
+          <w:rFonts w:ascii="Times New Roman" w:eastAsia="Times New Roman" w:hAnsi="Times New Roman" w:cs="Times New Roman"/>
+          <w:kern w:val="0"/>
+          <w:sz w:val="24"/>
+          <w:szCs w:val="24"/>
+          <w:lang w:eastAsia="bg-BG"/>
+          <w14:ligatures w14:val="none"/>
+        </w:rPr>
+        <w:t>our</w:t>
+      </w:r>
+      <w:proofErr w:type="spellEnd"/>
+      <w:r>
+        <w:rPr>
+          <w:rFonts w:ascii="Times New Roman" w:eastAsia="Times New Roman" w:hAnsi="Times New Roman" w:cs="Times New Roman"/>
+          <w:kern w:val="0"/>
+          <w:sz w:val="24"/>
+          <w:szCs w:val="24"/>
+          <w:lang w:eastAsia="bg-BG"/>
+          <w14:ligatures w14:val="none"/>
+        </w:rPr>
+        <w:t xml:space="preserve"> </w:t>
+      </w:r>
+      <w:proofErr w:type="spellStart"/>
+      <w:r>
+        <w:rPr>
+          <w:rFonts w:ascii="Times New Roman" w:eastAsia="Times New Roman" w:hAnsi="Times New Roman" w:cs="Times New Roman"/>
+          <w:kern w:val="0"/>
+          <w:sz w:val="24"/>
+          <w:szCs w:val="24"/>
+          <w:lang w:eastAsia="bg-BG"/>
+          <w14:ligatures w14:val="none"/>
+        </w:rPr>
+        <w:t>project</w:t>
+      </w:r>
+      <w:proofErr w:type="spellEnd"/>
+      <w:r>
+        <w:rPr>
+          <w:rFonts w:ascii="Times New Roman" w:eastAsia="Times New Roman" w:hAnsi="Times New Roman" w:cs="Times New Roman"/>
+          <w:kern w:val="0"/>
+          <w:sz w:val="24"/>
+          <w:szCs w:val="24"/>
+          <w:lang w:eastAsia="bg-BG"/>
+          <w14:ligatures w14:val="none"/>
+        </w:rPr>
+        <w:t>.</w:t>
+      </w:r>
+      <w:bookmarkStart w:id="26" w:name="_GoBack"/>
+      <w:bookmarkEnd w:id="26"/>
     </w:p>
     <w:sectPr>
       <w:footerReference w:type="default" r:id="rId10"/>
@@ -3116,7 +5182,7 @@
 </file>
 
 <file path=word/endnotes.xml><?xml version="1.0" encoding="utf-8"?>
-<w:endnotes xmlns:wpc="http://schemas.microsoft.com/office/word/2010/wordprocessingCanvas" xmlns:cx="http://schemas.microsoft.com/office/drawing/2014/chartex" xmlns:cx1="http://schemas.microsoft.com/office/drawing/2015/9/8/chartex" xmlns:cx2="http://schemas.microsoft.com/office/drawing/2015/10/21/chartex" xmlns:cx3="http://schemas.microsoft.com/office/drawing/2016/5/9/chartex" xmlns:cx4="http://schemas.microsoft.com/office/drawing/2016/5/10/chartex" xmlns:cx5="http://schemas.microsoft.com/office/drawing/2016/5/11/chartex" xmlns:cx6="http://schemas.microsoft.com/office/drawing/2016/5/12/chartex" xmlns:cx7="http://schemas.microsoft.com/office/drawing/2016/5/13/chartex" xmlns:cx8="http://schemas.microsoft.com/office/drawing/2016/5/14/chartex" xmlns:mc="http://schemas.openxmlformats.org/markup-compatibility/2006" xmlns:aink="http://schemas.microsoft.com/office/drawing/2016/ink" xmlns:am3d="http://schemas.microsoft.com/office/drawing/2017/model3d" xmlns:o="urn:schemas-microsoft-com:office:office" xmlns:oel="http://schemas.microsoft.com/office/2019/extlst" xmlns:r="http://schemas.openxmlformats.org/officeDocument/2006/relationships" xmlns:m="http://schemas.openxmlformats.org/officeDocument/2006/math" xmlns:v="urn:schemas-microsoft-com:vml" xmlns:wp14="http://schemas.microsoft.com/office/word/2010/wordprocessingDrawing" xmlns:wp="http://schemas.openxmlformats.org/drawingml/2006/wordprocessingDrawing" xmlns:w10="urn:schemas-microsoft-com:office:word" xmlns:w="http://schemas.openxmlformats.org/wordprocessingml/2006/main" xmlns:w14="http://schemas.microsoft.com/office/word/2010/wordml" xmlns:w15="http://schemas.microsoft.com/office/word/2012/wordml" xmlns:w16cex="http://schemas.microsoft.com/office/word/2018/wordml/cex" xmlns:w16cid="http://schemas.microsoft.com/office/word/2016/wordml/cid" xmlns:w16="http://schemas.microsoft.com/office/word/2018/wordml" xmlns:w16du="http://schemas.microsoft.com/office/word/2023/wordml/word16du" xmlns:w16sdtdh="http://schemas.microsoft.com/office/word/2020/wordml/sdtdatahash" xmlns:w16sdtfl="http://schemas.microsoft.com/office/word/2024/wordml/sdtformatlock" xmlns:w16se="http://schemas.microsoft.com/office/word/2015/wordml/symex" xmlns:wpg="http://schemas.microsoft.com/office/word/2010/wordprocessingGroup" xmlns:wpi="http://schemas.microsoft.com/office/word/2010/wordprocessingInk" xmlns:wne="http://schemas.microsoft.com/office/word/2006/wordml" xmlns:wps="http://schemas.microsoft.com/office/word/2010/wordprocessingShape" mc:Ignorable="w14 w15 w16se w16cid w16 w16cex w16sdtdh w16sdtfl w16du wp14">
+<w:endnotes xmlns:wpc="http://schemas.microsoft.com/office/word/2010/wordprocessingCanvas" xmlns:cx="http://schemas.microsoft.com/office/drawing/2014/chartex" xmlns:mc="http://schemas.openxmlformats.org/markup-compatibility/2006" xmlns:o="urn:schemas-microsoft-com:office:office" xmlns:r="http://schemas.openxmlformats.org/officeDocument/2006/relationships" xmlns:m="http://schemas.openxmlformats.org/officeDocument/2006/math" xmlns:v="urn:schemas-microsoft-com:vml" xmlns:wp14="http://schemas.microsoft.com/office/word/2010/wordprocessingDrawing" xmlns:wp="http://schemas.openxmlformats.org/drawingml/2006/wordprocessingDrawing" xmlns:w10="urn:schemas-microsoft-com:office:word" xmlns:w="http://schemas.openxmlformats.org/wordprocessingml/2006/main" xmlns:w14="http://schemas.microsoft.com/office/word/2010/wordml" xmlns:w15="http://schemas.microsoft.com/office/word/2012/wordml" xmlns:w16se="http://schemas.microsoft.com/office/word/2015/wordml/symex" xmlns:wpg="http://schemas.microsoft.com/office/word/2010/wordprocessingGroup" xmlns:wpi="http://schemas.microsoft.com/office/word/2010/wordprocessingInk" xmlns:wne="http://schemas.microsoft.com/office/word/2006/wordml" xmlns:wps="http://schemas.microsoft.com/office/word/2010/wordprocessingShape" mc:Ignorable="w14 w15 w16se wp14">
   <w:endnote w:type="separator" w:id="-1">
     <w:p>
       <w:pPr>
@@ -3141,7 +5207,7 @@
 </file>
 
 <file path=word/footer1.xml><?xml version="1.0" encoding="utf-8"?>
-<w:ftr xmlns:wpc="http://schemas.microsoft.com/office/word/2010/wordprocessingCanvas" xmlns:cx="http://schemas.microsoft.com/office/drawing/2014/chartex" xmlns:cx1="http://schemas.microsoft.com/office/drawing/2015/9/8/chartex" xmlns:cx2="http://schemas.microsoft.com/office/drawing/2015/10/21/chartex" xmlns:cx3="http://schemas.microsoft.com/office/drawing/2016/5/9/chartex" xmlns:cx4="http://schemas.microsoft.com/office/drawing/2016/5/10/chartex" xmlns:cx5="http://schemas.microsoft.com/office/drawing/2016/5/11/chartex" xmlns:cx6="http://schemas.microsoft.com/office/drawing/2016/5/12/chartex" xmlns:cx7="http://schemas.microsoft.com/office/drawing/2016/5/13/chartex" xmlns:cx8="http://schemas.microsoft.com/office/drawing/2016/5/14/chartex" xmlns:mc="http://schemas.openxmlformats.org/markup-compatibility/2006" xmlns:aink="http://schemas.microsoft.com/office/drawing/2016/ink" xmlns:am3d="http://schemas.microsoft.com/office/drawing/2017/model3d" xmlns:o="urn:schemas-microsoft-com:office:office" xmlns:oel="http://schemas.microsoft.com/office/2019/extlst" xmlns:r="http://schemas.openxmlformats.org/officeDocument/2006/relationships" xmlns:m="http://schemas.openxmlformats.org/officeDocument/2006/math" xmlns:v="urn:schemas-microsoft-com:vml" xmlns:wp14="http://schemas.microsoft.com/office/word/2010/wordprocessingDrawing" xmlns:wp="http://schemas.openxmlformats.org/drawingml/2006/wordprocessingDrawing" xmlns:w10="urn:schemas-microsoft-com:office:word" xmlns:w="http://schemas.openxmlformats.org/wordprocessingml/2006/main" xmlns:w14="http://schemas.microsoft.com/office/word/2010/wordml" xmlns:w15="http://schemas.microsoft.com/office/word/2012/wordml" xmlns:w16cex="http://schemas.microsoft.com/office/word/2018/wordml/cex" xmlns:w16cid="http://schemas.microsoft.com/office/word/2016/wordml/cid" xmlns:w16="http://schemas.microsoft.com/office/word/2018/wordml" xmlns:w16du="http://schemas.microsoft.com/office/word/2023/wordml/word16du" xmlns:w16sdtdh="http://schemas.microsoft.com/office/word/2020/wordml/sdtdatahash" xmlns:w16sdtfl="http://schemas.microsoft.com/office/word/2024/wordml/sdtformatlock" xmlns:w16se="http://schemas.microsoft.com/office/word/2015/wordml/symex" xmlns:wpg="http://schemas.microsoft.com/office/word/2010/wordprocessingGroup" xmlns:wpi="http://schemas.microsoft.com/office/word/2010/wordprocessingInk" xmlns:wne="http://schemas.microsoft.com/office/word/2006/wordml" xmlns:wps="http://schemas.microsoft.com/office/word/2010/wordprocessingShape" mc:Ignorable="w14 w15 w16se w16cid w16 w16cex w16sdtdh w16sdtfl w16du wp14">
+<w:ftr xmlns:wpc="http://schemas.microsoft.com/office/word/2010/wordprocessingCanvas" xmlns:cx="http://schemas.microsoft.com/office/drawing/2014/chartex" xmlns:mc="http://schemas.openxmlformats.org/markup-compatibility/2006" xmlns:o="urn:schemas-microsoft-com:office:office" xmlns:r="http://schemas.openxmlformats.org/officeDocument/2006/relationships" xmlns:m="http://schemas.openxmlformats.org/officeDocument/2006/math" xmlns:v="urn:schemas-microsoft-com:vml" xmlns:wp14="http://schemas.microsoft.com/office/word/2010/wordprocessingDrawing" xmlns:wp="http://schemas.openxmlformats.org/drawingml/2006/wordprocessingDrawing" xmlns:w10="urn:schemas-microsoft-com:office:word" xmlns:w="http://schemas.openxmlformats.org/wordprocessingml/2006/main" xmlns:w14="http://schemas.microsoft.com/office/word/2010/wordml" xmlns:w15="http://schemas.microsoft.com/office/word/2012/wordml" xmlns:w16se="http://schemas.microsoft.com/office/word/2015/wordml/symex" xmlns:wpg="http://schemas.microsoft.com/office/word/2010/wordprocessingGroup" xmlns:wpi="http://schemas.microsoft.com/office/word/2010/wordprocessingInk" xmlns:wne="http://schemas.microsoft.com/office/word/2006/wordml" xmlns:wps="http://schemas.microsoft.com/office/word/2010/wordprocessingShape" mc:Ignorable="w14 w15 w16se wp14">
   <w:sdt>
     <w:sdtPr>
       <w:id w:val="1359540360"/>
@@ -3150,10 +5216,11 @@
         <w:docPartUnique/>
       </w:docPartObj>
     </w:sdtPr>
+    <w:sdtEndPr/>
     <w:sdtContent>
       <w:p>
         <w:pPr>
-          <w:pStyle w:val="Footer"/>
+          <w:pStyle w:val="af4"/>
         </w:pPr>
         <w:r>
           <w:fldChar w:fldCharType="begin"/>
@@ -3165,6 +5232,9 @@
           <w:fldChar w:fldCharType="separate"/>
         </w:r>
         <w:r>
+          <w:rPr>
+            <w:noProof/>
+          </w:rPr>
           <w:t>2</w:t>
         </w:r>
         <w:r>
@@ -3177,7 +5247,7 @@
 </file>
 
 <file path=word/footnotes.xml><?xml version="1.0" encoding="utf-8"?>
-<w:footnotes xmlns:wpc="http://schemas.microsoft.com/office/word/2010/wordprocessingCanvas" xmlns:cx="http://schemas.microsoft.com/office/drawing/2014/chartex" xmlns:cx1="http://schemas.microsoft.com/office/drawing/2015/9/8/chartex" xmlns:cx2="http://schemas.microsoft.com/office/drawing/2015/10/21/chartex" xmlns:cx3="http://schemas.microsoft.com/office/drawing/2016/5/9/chartex" xmlns:cx4="http://schemas.microsoft.com/office/drawing/2016/5/10/chartex" xmlns:cx5="http://schemas.microsoft.com/office/drawing/2016/5/11/chartex" xmlns:cx6="http://schemas.microsoft.com/office/drawing/2016/5/12/chartex" xmlns:cx7="http://schemas.microsoft.com/office/drawing/2016/5/13/chartex" xmlns:cx8="http://schemas.microsoft.com/office/drawing/2016/5/14/chartex" xmlns:mc="http://schemas.openxmlformats.org/markup-compatibility/2006" xmlns:aink="http://schemas.microsoft.com/office/drawing/2016/ink" xmlns:am3d="http://schemas.microsoft.com/office/drawing/2017/model3d" xmlns:o="urn:schemas-microsoft-com:office:office" xmlns:oel="http://schemas.microsoft.com/office/2019/extlst" xmlns:r="http://schemas.openxmlformats.org/officeDocument/2006/relationships" xmlns:m="http://schemas.openxmlformats.org/officeDocument/2006/math" xmlns:v="urn:schemas-microsoft-com:vml" xmlns:wp14="http://schemas.microsoft.com/office/word/2010/wordprocessingDrawing" xmlns:wp="http://schemas.openxmlformats.org/drawingml/2006/wordprocessingDrawing" xmlns:w10="urn:schemas-microsoft-com:office:word" xmlns:w="http://schemas.openxmlformats.org/wordprocessingml/2006/main" xmlns:w14="http://schemas.microsoft.com/office/word/2010/wordml" xmlns:w15="http://schemas.microsoft.com/office/word/2012/wordml" xmlns:w16cex="http://schemas.microsoft.com/office/word/2018/wordml/cex" xmlns:w16cid="http://schemas.microsoft.com/office/word/2016/wordml/cid" xmlns:w16="http://schemas.microsoft.com/office/word/2018/wordml" xmlns:w16du="http://schemas.microsoft.com/office/word/2023/wordml/word16du" xmlns:w16sdtdh="http://schemas.microsoft.com/office/word/2020/wordml/sdtdatahash" xmlns:w16sdtfl="http://schemas.microsoft.com/office/word/2024/wordml/sdtformatlock" xmlns:w16se="http://schemas.microsoft.com/office/word/2015/wordml/symex" xmlns:wpg="http://schemas.microsoft.com/office/word/2010/wordprocessingGroup" xmlns:wpi="http://schemas.microsoft.com/office/word/2010/wordprocessingInk" xmlns:wne="http://schemas.microsoft.com/office/word/2006/wordml" xmlns:wps="http://schemas.microsoft.com/office/word/2010/wordprocessingShape" mc:Ignorable="w14 w15 w16se w16cid w16 w16cex w16sdtdh w16sdtfl w16du wp14">
+<w:footnotes xmlns:wpc="http://schemas.microsoft.com/office/word/2010/wordprocessingCanvas" xmlns:cx="http://schemas.microsoft.com/office/drawing/2014/chartex" xmlns:mc="http://schemas.openxmlformats.org/markup-compatibility/2006" xmlns:o="urn:schemas-microsoft-com:office:office" xmlns:r="http://schemas.openxmlformats.org/officeDocument/2006/relationships" xmlns:m="http://schemas.openxmlformats.org/officeDocument/2006/math" xmlns:v="urn:schemas-microsoft-com:vml" xmlns:wp14="http://schemas.microsoft.com/office/word/2010/wordprocessingDrawing" xmlns:wp="http://schemas.openxmlformats.org/drawingml/2006/wordprocessingDrawing" xmlns:w10="urn:schemas-microsoft-com:office:word" xmlns:w="http://schemas.openxmlformats.org/wordprocessingml/2006/main" xmlns:w14="http://schemas.microsoft.com/office/word/2010/wordml" xmlns:w15="http://schemas.microsoft.com/office/word/2012/wordml" xmlns:w16se="http://schemas.microsoft.com/office/word/2015/wordml/symex" xmlns:wpg="http://schemas.microsoft.com/office/word/2010/wordprocessingGroup" xmlns:wpi="http://schemas.microsoft.com/office/word/2010/wordprocessingInk" xmlns:wne="http://schemas.microsoft.com/office/word/2006/wordml" xmlns:wps="http://schemas.microsoft.com/office/word/2010/wordprocessingShape" mc:Ignorable="w14 w15 w16se wp14">
   <w:footnote w:type="separator" w:id="-1">
     <w:p>
       <w:pPr>
@@ -3202,7 +5272,7 @@
 </file>
 
 <file path=word/numbering.xml><?xml version="1.0" encoding="utf-8"?>
-<w:numbering xmlns:wpc="http://schemas.microsoft.com/office/word/2010/wordprocessingCanvas" xmlns:cx="http://schemas.microsoft.com/office/drawing/2014/chartex" xmlns:cx1="http://schemas.microsoft.com/office/drawing/2015/9/8/chartex" xmlns:cx2="http://schemas.microsoft.com/office/drawing/2015/10/21/chartex" xmlns:cx3="http://schemas.microsoft.com/office/drawing/2016/5/9/chartex" xmlns:cx4="http://schemas.microsoft.com/office/drawing/2016/5/10/chartex" xmlns:cx5="http://schemas.microsoft.com/office/drawing/2016/5/11/chartex" xmlns:cx6="http://schemas.microsoft.com/office/drawing/2016/5/12/chartex" xmlns:cx7="http://schemas.microsoft.com/office/drawing/2016/5/13/chartex" xmlns:cx8="http://schemas.microsoft.com/office/drawing/2016/5/14/chartex" xmlns:mc="http://schemas.openxmlformats.org/markup-compatibility/2006" xmlns:aink="http://schemas.microsoft.com/office/drawing/2016/ink" xmlns:am3d="http://schemas.microsoft.com/office/drawing/2017/model3d" xmlns:o="urn:schemas-microsoft-com:office:office" xmlns:oel="http://schemas.microsoft.com/office/2019/extlst" xmlns:r="http://schemas.openxmlformats.org/officeDocument/2006/relationships" xmlns:m="http://schemas.openxmlformats.org/officeDocument/2006/math" xmlns:v="urn:schemas-microsoft-com:vml" xmlns:wp14="http://schemas.microsoft.com/office/word/2010/wordprocessingDrawing" xmlns:wp="http://schemas.openxmlformats.org/drawingml/2006/wordprocessingDrawing" xmlns:w10="urn:schemas-microsoft-com:office:word" xmlns:w="http://schemas.openxmlformats.org/wordprocessingml/2006/main" xmlns:w14="http://schemas.microsoft.com/office/word/2010/wordml" xmlns:w15="http://schemas.microsoft.com/office/word/2012/wordml" xmlns:w16cex="http://schemas.microsoft.com/office/word/2018/wordml/cex" xmlns:w16cid="http://schemas.microsoft.com/office/word/2016/wordml/cid" xmlns:w16="http://schemas.microsoft.com/office/word/2018/wordml" xmlns:w16du="http://schemas.microsoft.com/office/word/2023/wordml/word16du" xmlns:w16sdtdh="http://schemas.microsoft.com/office/word/2020/wordml/sdtdatahash" xmlns:w16sdtfl="http://schemas.microsoft.com/office/word/2024/wordml/sdtformatlock" xmlns:w16se="http://schemas.microsoft.com/office/word/2015/wordml/symex" xmlns:wpg="http://schemas.microsoft.com/office/word/2010/wordprocessingGroup" xmlns:wpi="http://schemas.microsoft.com/office/word/2010/wordprocessingInk" xmlns:wne="http://schemas.microsoft.com/office/word/2006/wordml" xmlns:wps="http://schemas.microsoft.com/office/word/2010/wordprocessingShape" mc:Ignorable="w14 w15 w16se w16cid w16 w16cex w16sdtdh w16sdtfl w16du wp14">
+<w:numbering xmlns:wpc="http://schemas.microsoft.com/office/word/2010/wordprocessingCanvas" xmlns:cx="http://schemas.microsoft.com/office/drawing/2014/chartex" xmlns:mc="http://schemas.openxmlformats.org/markup-compatibility/2006" xmlns:o="urn:schemas-microsoft-com:office:office" xmlns:r="http://schemas.openxmlformats.org/officeDocument/2006/relationships" xmlns:m="http://schemas.openxmlformats.org/officeDocument/2006/math" xmlns:v="urn:schemas-microsoft-com:vml" xmlns:wp14="http://schemas.microsoft.com/office/word/2010/wordprocessingDrawing" xmlns:wp="http://schemas.openxmlformats.org/drawingml/2006/wordprocessingDrawing" xmlns:w10="urn:schemas-microsoft-com:office:word" xmlns:w="http://schemas.openxmlformats.org/wordprocessingml/2006/main" xmlns:w14="http://schemas.microsoft.com/office/word/2010/wordml" xmlns:w15="http://schemas.microsoft.com/office/word/2012/wordml" xmlns:w16se="http://schemas.microsoft.com/office/word/2015/wordml/symex" xmlns:wpg="http://schemas.microsoft.com/office/word/2010/wordprocessingGroup" xmlns:wpi="http://schemas.microsoft.com/office/word/2010/wordprocessingInk" xmlns:wne="http://schemas.microsoft.com/office/word/2006/wordml" xmlns:wps="http://schemas.microsoft.com/office/word/2010/wordprocessingShape" mc:Ignorable="w14 w15 w16se wp14">
   <w:abstractNum w:abstractNumId="0" w15:restartNumberingAfterBreak="0">
     <w:nsid w:val="07F03F5E"/>
     <w:multiLevelType w:val="hybridMultilevel"/>
@@ -4005,38 +6075,38 @@
       </w:pPr>
     </w:lvl>
   </w:abstractNum>
-  <w:num w:numId="1" w16cid:durableId="1789352560">
+  <w:num w:numId="1">
     <w:abstractNumId w:val="7"/>
   </w:num>
-  <w:num w:numId="2" w16cid:durableId="907230370">
+  <w:num w:numId="2">
     <w:abstractNumId w:val="1"/>
   </w:num>
-  <w:num w:numId="3" w16cid:durableId="1581214957">
+  <w:num w:numId="3">
     <w:abstractNumId w:val="2"/>
   </w:num>
-  <w:num w:numId="4" w16cid:durableId="1274895748">
+  <w:num w:numId="4">
     <w:abstractNumId w:val="4"/>
   </w:num>
-  <w:num w:numId="5" w16cid:durableId="1042365012">
+  <w:num w:numId="5">
     <w:abstractNumId w:val="8"/>
   </w:num>
-  <w:num w:numId="6" w16cid:durableId="634066751">
+  <w:num w:numId="6">
     <w:abstractNumId w:val="0"/>
   </w:num>
-  <w:num w:numId="7" w16cid:durableId="1108233771">
+  <w:num w:numId="7">
     <w:abstractNumId w:val="3"/>
   </w:num>
-  <w:num w:numId="8" w16cid:durableId="504328004">
+  <w:num w:numId="8">
     <w:abstractNumId w:val="5"/>
   </w:num>
-  <w:num w:numId="9" w16cid:durableId="1644967227">
+  <w:num w:numId="9">
     <w:abstractNumId w:val="6"/>
   </w:num>
 </w:numbering>
 </file>
 
 <file path=word/styles.xml><?xml version="1.0" encoding="utf-8"?>
-<w:styles xmlns:mc="http://schemas.openxmlformats.org/markup-compatibility/2006" xmlns:r="http://schemas.openxmlformats.org/officeDocument/2006/relationships" xmlns:w="http://schemas.openxmlformats.org/wordprocessingml/2006/main" xmlns:w14="http://schemas.microsoft.com/office/word/2010/wordml" xmlns:w15="http://schemas.microsoft.com/office/word/2012/wordml" xmlns:w16cex="http://schemas.microsoft.com/office/word/2018/wordml/cex" xmlns:w16cid="http://schemas.microsoft.com/office/word/2016/wordml/cid" xmlns:w16="http://schemas.microsoft.com/office/word/2018/wordml" xmlns:w16du="http://schemas.microsoft.com/office/word/2023/wordml/word16du" xmlns:w16sdtdh="http://schemas.microsoft.com/office/word/2020/wordml/sdtdatahash" xmlns:w16sdtfl="http://schemas.microsoft.com/office/word/2024/wordml/sdtformatlock" xmlns:w16se="http://schemas.microsoft.com/office/word/2015/wordml/symex" mc:Ignorable="w14 w15 w16se w16cid w16 w16cex w16sdtdh w16sdtfl w16du">
+<w:styles xmlns:mc="http://schemas.openxmlformats.org/markup-compatibility/2006" xmlns:r="http://schemas.openxmlformats.org/officeDocument/2006/relationships" xmlns:w="http://schemas.openxmlformats.org/wordprocessingml/2006/main" xmlns:w14="http://schemas.microsoft.com/office/word/2010/wordml" xmlns:w15="http://schemas.microsoft.com/office/word/2012/wordml" xmlns:w16se="http://schemas.microsoft.com/office/word/2015/wordml/symex" mc:Ignorable="w14 w15 w16se">
   <w:docDefaults>
     <w:rPrDefault>
       <w:rPr>
@@ -4054,7 +6124,7 @@
       </w:pPr>
     </w:pPrDefault>
   </w:docDefaults>
-  <w:latentStyles w:defLockedState="0" w:defUIPriority="99" w:defSemiHidden="0" w:defUnhideWhenUsed="0" w:defQFormat="0" w:count="376">
+  <w:latentStyles w:defLockedState="0" w:defUIPriority="99" w:defSemiHidden="0" w:defUnhideWhenUsed="0" w:defQFormat="0" w:count="371">
     <w:lsdException w:name="Normal" w:uiPriority="0" w:qFormat="1"/>
     <w:lsdException w:name="heading 1" w:uiPriority="9" w:qFormat="1"/>
     <w:lsdException w:name="heading 2" w:semiHidden="1" w:uiPriority="9" w:unhideWhenUsed="1" w:qFormat="1"/>
@@ -4426,22 +6496,17 @@
     <w:lsdException w:name="List Table 5 Dark Accent 6" w:uiPriority="50"/>
     <w:lsdException w:name="List Table 6 Colorful Accent 6" w:uiPriority="51"/>
     <w:lsdException w:name="List Table 7 Colorful Accent 6" w:uiPriority="52"/>
-    <w:lsdException w:name="Mention" w:semiHidden="1" w:unhideWhenUsed="1"/>
-    <w:lsdException w:name="Smart Hyperlink" w:semiHidden="1" w:unhideWhenUsed="1"/>
-    <w:lsdException w:name="Hashtag" w:semiHidden="1" w:unhideWhenUsed="1"/>
-    <w:lsdException w:name="Unresolved Mention" w:semiHidden="1" w:unhideWhenUsed="1"/>
-    <w:lsdException w:name="Smart Link" w:semiHidden="1" w:unhideWhenUsed="1"/>
   </w:latentStyles>
-  <w:style w:type="paragraph" w:default="1" w:styleId="Normal">
+  <w:style w:type="paragraph" w:default="1" w:styleId="a">
     <w:name w:val="Normal"/>
     <w:qFormat/>
     <w:rsid w:val="00050590"/>
   </w:style>
-  <w:style w:type="paragraph" w:styleId="Heading1">
+  <w:style w:type="paragraph" w:styleId="1">
     <w:name w:val="heading 1"/>
-    <w:basedOn w:val="Normal"/>
-    <w:next w:val="Normal"/>
-    <w:link w:val="Heading1Char"/>
+    <w:basedOn w:val="a"/>
+    <w:next w:val="a"/>
+    <w:link w:val="10"/>
     <w:uiPriority w:val="9"/>
     <w:qFormat/>
     <w:rsid w:val="004D52F9"/>
@@ -4458,11 +6523,11 @@
       <w:szCs w:val="40"/>
     </w:rPr>
   </w:style>
-  <w:style w:type="paragraph" w:styleId="Heading2">
+  <w:style w:type="paragraph" w:styleId="2">
     <w:name w:val="heading 2"/>
-    <w:basedOn w:val="Normal"/>
-    <w:next w:val="Normal"/>
-    <w:link w:val="Heading2Char"/>
+    <w:basedOn w:val="a"/>
+    <w:next w:val="a"/>
+    <w:link w:val="20"/>
     <w:uiPriority w:val="9"/>
     <w:unhideWhenUsed/>
     <w:qFormat/>
@@ -4480,11 +6545,11 @@
       <w:szCs w:val="32"/>
     </w:rPr>
   </w:style>
-  <w:style w:type="paragraph" w:styleId="Heading3">
+  <w:style w:type="paragraph" w:styleId="3">
     <w:name w:val="heading 3"/>
-    <w:basedOn w:val="Normal"/>
-    <w:next w:val="Normal"/>
-    <w:link w:val="Heading3Char"/>
+    <w:basedOn w:val="a"/>
+    <w:next w:val="a"/>
+    <w:link w:val="30"/>
     <w:uiPriority w:val="9"/>
     <w:unhideWhenUsed/>
     <w:qFormat/>
@@ -4502,11 +6567,11 @@
       <w:szCs w:val="28"/>
     </w:rPr>
   </w:style>
-  <w:style w:type="paragraph" w:styleId="Heading4">
+  <w:style w:type="paragraph" w:styleId="4">
     <w:name w:val="heading 4"/>
-    <w:basedOn w:val="Normal"/>
-    <w:next w:val="Normal"/>
-    <w:link w:val="Heading4Char"/>
+    <w:basedOn w:val="a"/>
+    <w:next w:val="a"/>
+    <w:link w:val="40"/>
     <w:uiPriority w:val="9"/>
     <w:unhideWhenUsed/>
     <w:qFormat/>
@@ -4524,11 +6589,11 @@
       <w:color w:val="0F4761" w:themeColor="accent1" w:themeShade="BF"/>
     </w:rPr>
   </w:style>
-  <w:style w:type="paragraph" w:styleId="Heading5">
+  <w:style w:type="paragraph" w:styleId="5">
     <w:name w:val="heading 5"/>
-    <w:basedOn w:val="Normal"/>
-    <w:next w:val="Normal"/>
-    <w:link w:val="Heading5Char"/>
+    <w:basedOn w:val="a"/>
+    <w:next w:val="a"/>
+    <w:link w:val="50"/>
     <w:uiPriority w:val="9"/>
     <w:semiHidden/>
     <w:unhideWhenUsed/>
@@ -4545,11 +6610,11 @@
       <w:color w:val="0F4761" w:themeColor="accent1" w:themeShade="BF"/>
     </w:rPr>
   </w:style>
-  <w:style w:type="paragraph" w:styleId="Heading6">
+  <w:style w:type="paragraph" w:styleId="6">
     <w:name w:val="heading 6"/>
-    <w:basedOn w:val="Normal"/>
-    <w:next w:val="Normal"/>
-    <w:link w:val="Heading6Char"/>
+    <w:basedOn w:val="a"/>
+    <w:next w:val="a"/>
+    <w:link w:val="60"/>
     <w:uiPriority w:val="9"/>
     <w:semiHidden/>
     <w:unhideWhenUsed/>
@@ -4568,11 +6633,11 @@
       <w:color w:val="595959" w:themeColor="text1" w:themeTint="A6"/>
     </w:rPr>
   </w:style>
-  <w:style w:type="paragraph" w:styleId="Heading7">
+  <w:style w:type="paragraph" w:styleId="7">
     <w:name w:val="heading 7"/>
-    <w:basedOn w:val="Normal"/>
-    <w:next w:val="Normal"/>
-    <w:link w:val="Heading7Char"/>
+    <w:basedOn w:val="a"/>
+    <w:next w:val="a"/>
+    <w:link w:val="70"/>
     <w:uiPriority w:val="9"/>
     <w:semiHidden/>
     <w:unhideWhenUsed/>
@@ -4589,11 +6654,11 @@
       <w:color w:val="595959" w:themeColor="text1" w:themeTint="A6"/>
     </w:rPr>
   </w:style>
-  <w:style w:type="paragraph" w:styleId="Heading8">
+  <w:style w:type="paragraph" w:styleId="8">
     <w:name w:val="heading 8"/>
-    <w:basedOn w:val="Normal"/>
-    <w:next w:val="Normal"/>
-    <w:link w:val="Heading8Char"/>
+    <w:basedOn w:val="a"/>
+    <w:next w:val="a"/>
+    <w:link w:val="80"/>
     <w:uiPriority w:val="9"/>
     <w:semiHidden/>
     <w:unhideWhenUsed/>
@@ -4612,11 +6677,11 @@
       <w:color w:val="272727" w:themeColor="text1" w:themeTint="D8"/>
     </w:rPr>
   </w:style>
-  <w:style w:type="paragraph" w:styleId="Heading9">
+  <w:style w:type="paragraph" w:styleId="9">
     <w:name w:val="heading 9"/>
-    <w:basedOn w:val="Normal"/>
-    <w:next w:val="Normal"/>
-    <w:link w:val="Heading9Char"/>
+    <w:basedOn w:val="a"/>
+    <w:next w:val="a"/>
+    <w:link w:val="90"/>
     <w:uiPriority w:val="9"/>
     <w:semiHidden/>
     <w:unhideWhenUsed/>
@@ -4633,13 +6698,13 @@
       <w:color w:val="272727" w:themeColor="text1" w:themeTint="D8"/>
     </w:rPr>
   </w:style>
-  <w:style w:type="character" w:default="1" w:styleId="DefaultParagraphFont">
+  <w:style w:type="character" w:default="1" w:styleId="a0">
     <w:name w:val="Default Paragraph Font"/>
     <w:uiPriority w:val="1"/>
     <w:semiHidden/>
     <w:unhideWhenUsed/>
   </w:style>
-  <w:style w:type="table" w:default="1" w:styleId="TableNormal">
+  <w:style w:type="table" w:default="1" w:styleId="a1">
     <w:name w:val="Normal Table"/>
     <w:uiPriority w:val="99"/>
     <w:semiHidden/>
@@ -4654,16 +6719,16 @@
       </w:tblCellMar>
     </w:tblPr>
   </w:style>
-  <w:style w:type="numbering" w:default="1" w:styleId="NoList">
+  <w:style w:type="numbering" w:default="1" w:styleId="a2">
     <w:name w:val="No List"/>
     <w:uiPriority w:val="99"/>
     <w:semiHidden/>
     <w:unhideWhenUsed/>
   </w:style>
-  <w:style w:type="character" w:customStyle="1" w:styleId="Heading1Char">
-    <w:name w:val="Heading 1 Char"/>
-    <w:basedOn w:val="DefaultParagraphFont"/>
-    <w:link w:val="Heading1"/>
+  <w:style w:type="character" w:customStyle="1" w:styleId="10">
+    <w:name w:val="Заглавие 1 Знак"/>
+    <w:basedOn w:val="a0"/>
+    <w:link w:val="1"/>
     <w:uiPriority w:val="9"/>
     <w:rsid w:val="004D52F9"/>
     <w:rPr>
@@ -4673,10 +6738,10 @@
       <w:szCs w:val="40"/>
     </w:rPr>
   </w:style>
-  <w:style w:type="character" w:customStyle="1" w:styleId="Heading2Char">
-    <w:name w:val="Heading 2 Char"/>
-    <w:basedOn w:val="DefaultParagraphFont"/>
-    <w:link w:val="Heading2"/>
+  <w:style w:type="character" w:customStyle="1" w:styleId="20">
+    <w:name w:val="Заглавие 2 Знак"/>
+    <w:basedOn w:val="a0"/>
+    <w:link w:val="2"/>
     <w:uiPriority w:val="9"/>
     <w:rsid w:val="004D52F9"/>
     <w:rPr>
@@ -4686,10 +6751,10 @@
       <w:szCs w:val="32"/>
     </w:rPr>
   </w:style>
-  <w:style w:type="character" w:customStyle="1" w:styleId="Heading3Char">
-    <w:name w:val="Heading 3 Char"/>
-    <w:basedOn w:val="DefaultParagraphFont"/>
-    <w:link w:val="Heading3"/>
+  <w:style w:type="character" w:customStyle="1" w:styleId="30">
+    <w:name w:val="Заглавие 3 Знак"/>
+    <w:basedOn w:val="a0"/>
+    <w:link w:val="3"/>
     <w:uiPriority w:val="9"/>
     <w:rsid w:val="004D52F9"/>
     <w:rPr>
@@ -4699,10 +6764,10 @@
       <w:szCs w:val="28"/>
     </w:rPr>
   </w:style>
-  <w:style w:type="character" w:customStyle="1" w:styleId="Heading4Char">
-    <w:name w:val="Heading 4 Char"/>
-    <w:basedOn w:val="DefaultParagraphFont"/>
-    <w:link w:val="Heading4"/>
+  <w:style w:type="character" w:customStyle="1" w:styleId="40">
+    <w:name w:val="Заглавие 4 Знак"/>
+    <w:basedOn w:val="a0"/>
+    <w:link w:val="4"/>
     <w:uiPriority w:val="9"/>
     <w:rsid w:val="004D52F9"/>
     <w:rPr>
@@ -4712,10 +6777,10 @@
       <w:color w:val="0F4761" w:themeColor="accent1" w:themeShade="BF"/>
     </w:rPr>
   </w:style>
-  <w:style w:type="character" w:customStyle="1" w:styleId="Heading5Char">
-    <w:name w:val="Heading 5 Char"/>
-    <w:basedOn w:val="DefaultParagraphFont"/>
-    <w:link w:val="Heading5"/>
+  <w:style w:type="character" w:customStyle="1" w:styleId="50">
+    <w:name w:val="Заглавие 5 Знак"/>
+    <w:basedOn w:val="a0"/>
+    <w:link w:val="5"/>
     <w:uiPriority w:val="9"/>
     <w:semiHidden/>
     <w:rsid w:val="004D52F9"/>
@@ -4724,10 +6789,10 @@
       <w:color w:val="0F4761" w:themeColor="accent1" w:themeShade="BF"/>
     </w:rPr>
   </w:style>
-  <w:style w:type="character" w:customStyle="1" w:styleId="Heading6Char">
-    <w:name w:val="Heading 6 Char"/>
-    <w:basedOn w:val="DefaultParagraphFont"/>
-    <w:link w:val="Heading6"/>
+  <w:style w:type="character" w:customStyle="1" w:styleId="60">
+    <w:name w:val="Заглавие 6 Знак"/>
+    <w:basedOn w:val="a0"/>
+    <w:link w:val="6"/>
     <w:uiPriority w:val="9"/>
     <w:semiHidden/>
     <w:rsid w:val="004D52F9"/>
@@ -4738,10 +6803,10 @@
       <w:color w:val="595959" w:themeColor="text1" w:themeTint="A6"/>
     </w:rPr>
   </w:style>
-  <w:style w:type="character" w:customStyle="1" w:styleId="Heading7Char">
-    <w:name w:val="Heading 7 Char"/>
-    <w:basedOn w:val="DefaultParagraphFont"/>
-    <w:link w:val="Heading7"/>
+  <w:style w:type="character" w:customStyle="1" w:styleId="70">
+    <w:name w:val="Заглавие 7 Знак"/>
+    <w:basedOn w:val="a0"/>
+    <w:link w:val="7"/>
     <w:uiPriority w:val="9"/>
     <w:semiHidden/>
     <w:rsid w:val="004D52F9"/>
@@ -4750,10 +6815,10 @@
       <w:color w:val="595959" w:themeColor="text1" w:themeTint="A6"/>
     </w:rPr>
   </w:style>
-  <w:style w:type="character" w:customStyle="1" w:styleId="Heading8Char">
-    <w:name w:val="Heading 8 Char"/>
-    <w:basedOn w:val="DefaultParagraphFont"/>
-    <w:link w:val="Heading8"/>
+  <w:style w:type="character" w:customStyle="1" w:styleId="80">
+    <w:name w:val="Заглавие 8 Знак"/>
+    <w:basedOn w:val="a0"/>
+    <w:link w:val="8"/>
     <w:uiPriority w:val="9"/>
     <w:semiHidden/>
     <w:rsid w:val="004D52F9"/>
@@ -4764,10 +6829,10 @@
       <w:color w:val="272727" w:themeColor="text1" w:themeTint="D8"/>
     </w:rPr>
   </w:style>
-  <w:style w:type="character" w:customStyle="1" w:styleId="Heading9Char">
-    <w:name w:val="Heading 9 Char"/>
-    <w:basedOn w:val="DefaultParagraphFont"/>
-    <w:link w:val="Heading9"/>
+  <w:style w:type="character" w:customStyle="1" w:styleId="90">
+    <w:name w:val="Заглавие 9 Знак"/>
+    <w:basedOn w:val="a0"/>
+    <w:link w:val="9"/>
     <w:uiPriority w:val="9"/>
     <w:semiHidden/>
     <w:rsid w:val="004D52F9"/>
@@ -4776,11 +6841,11 @@
       <w:color w:val="272727" w:themeColor="text1" w:themeTint="D8"/>
     </w:rPr>
   </w:style>
-  <w:style w:type="paragraph" w:styleId="Title">
+  <w:style w:type="paragraph" w:styleId="a3">
     <w:name w:val="Title"/>
-    <w:basedOn w:val="Normal"/>
-    <w:next w:val="Normal"/>
-    <w:link w:val="TitleChar"/>
+    <w:basedOn w:val="a"/>
+    <w:next w:val="a"/>
+    <w:link w:val="a4"/>
     <w:uiPriority w:val="10"/>
     <w:qFormat/>
     <w:rsid w:val="004D52F9"/>
@@ -4796,10 +6861,10 @@
       <w:szCs w:val="56"/>
     </w:rPr>
   </w:style>
-  <w:style w:type="character" w:customStyle="1" w:styleId="TitleChar">
-    <w:name w:val="Title Char"/>
-    <w:basedOn w:val="DefaultParagraphFont"/>
-    <w:link w:val="Title"/>
+  <w:style w:type="character" w:customStyle="1" w:styleId="a4">
+    <w:name w:val="Заглавие Знак"/>
+    <w:basedOn w:val="a0"/>
+    <w:link w:val="a3"/>
     <w:uiPriority w:val="10"/>
     <w:rsid w:val="004D52F9"/>
     <w:rPr>
@@ -4810,11 +6875,11 @@
       <w:szCs w:val="56"/>
     </w:rPr>
   </w:style>
-  <w:style w:type="paragraph" w:styleId="Subtitle">
+  <w:style w:type="paragraph" w:styleId="a5">
     <w:name w:val="Subtitle"/>
-    <w:basedOn w:val="Normal"/>
-    <w:next w:val="Normal"/>
-    <w:link w:val="SubtitleChar"/>
+    <w:basedOn w:val="a"/>
+    <w:next w:val="a"/>
+    <w:link w:val="a6"/>
     <w:uiPriority w:val="11"/>
     <w:qFormat/>
     <w:rsid w:val="004D52F9"/>
@@ -4831,10 +6896,10 @@
       <w:szCs w:val="28"/>
     </w:rPr>
   </w:style>
-  <w:style w:type="character" w:customStyle="1" w:styleId="SubtitleChar">
-    <w:name w:val="Subtitle Char"/>
-    <w:basedOn w:val="DefaultParagraphFont"/>
-    <w:link w:val="Subtitle"/>
+  <w:style w:type="character" w:customStyle="1" w:styleId="a6">
+    <w:name w:val="Подзаглавие Знак"/>
+    <w:basedOn w:val="a0"/>
+    <w:link w:val="a5"/>
     <w:uiPriority w:val="11"/>
     <w:rsid w:val="004D52F9"/>
     <w:rPr>
@@ -4845,11 +6910,11 @@
       <w:szCs w:val="28"/>
     </w:rPr>
   </w:style>
-  <w:style w:type="paragraph" w:styleId="Quote">
+  <w:style w:type="paragraph" w:styleId="a7">
     <w:name w:val="Quote"/>
-    <w:basedOn w:val="Normal"/>
-    <w:next w:val="Normal"/>
-    <w:link w:val="QuoteChar"/>
+    <w:basedOn w:val="a"/>
+    <w:next w:val="a"/>
+    <w:link w:val="a8"/>
     <w:uiPriority w:val="29"/>
     <w:qFormat/>
     <w:rsid w:val="004D52F9"/>
@@ -4863,10 +6928,10 @@
       <w:color w:val="404040" w:themeColor="text1" w:themeTint="BF"/>
     </w:rPr>
   </w:style>
-  <w:style w:type="character" w:customStyle="1" w:styleId="QuoteChar">
-    <w:name w:val="Quote Char"/>
-    <w:basedOn w:val="DefaultParagraphFont"/>
-    <w:link w:val="Quote"/>
+  <w:style w:type="character" w:customStyle="1" w:styleId="a8">
+    <w:name w:val="Цитат Знак"/>
+    <w:basedOn w:val="a0"/>
+    <w:link w:val="a7"/>
     <w:uiPriority w:val="29"/>
     <w:rsid w:val="004D52F9"/>
     <w:rPr>
@@ -4875,9 +6940,9 @@
       <w:color w:val="404040" w:themeColor="text1" w:themeTint="BF"/>
     </w:rPr>
   </w:style>
-  <w:style w:type="paragraph" w:styleId="ListParagraph">
+  <w:style w:type="paragraph" w:styleId="a9">
     <w:name w:val="List Paragraph"/>
-    <w:basedOn w:val="Normal"/>
+    <w:basedOn w:val="a"/>
     <w:uiPriority w:val="34"/>
     <w:qFormat/>
     <w:rsid w:val="004D52F9"/>
@@ -4886,9 +6951,9 @@
       <w:contextualSpacing/>
     </w:pPr>
   </w:style>
-  <w:style w:type="character" w:styleId="IntenseEmphasis">
+  <w:style w:type="character" w:styleId="aa">
     <w:name w:val="Intense Emphasis"/>
-    <w:basedOn w:val="DefaultParagraphFont"/>
+    <w:basedOn w:val="a0"/>
     <w:uiPriority w:val="21"/>
     <w:qFormat/>
     <w:rsid w:val="004D52F9"/>
@@ -4898,11 +6963,11 @@
       <w:color w:val="0F4761" w:themeColor="accent1" w:themeShade="BF"/>
     </w:rPr>
   </w:style>
-  <w:style w:type="paragraph" w:styleId="IntenseQuote">
+  <w:style w:type="paragraph" w:styleId="ab">
     <w:name w:val="Intense Quote"/>
-    <w:basedOn w:val="Normal"/>
-    <w:next w:val="Normal"/>
-    <w:link w:val="IntenseQuoteChar"/>
+    <w:basedOn w:val="a"/>
+    <w:next w:val="a"/>
+    <w:link w:val="ac"/>
     <w:uiPriority w:val="30"/>
     <w:qFormat/>
     <w:rsid w:val="004D52F9"/>
@@ -4921,10 +6986,10 @@
       <w:color w:val="0F4761" w:themeColor="accent1" w:themeShade="BF"/>
     </w:rPr>
   </w:style>
-  <w:style w:type="character" w:customStyle="1" w:styleId="IntenseQuoteChar">
-    <w:name w:val="Intense Quote Char"/>
-    <w:basedOn w:val="DefaultParagraphFont"/>
-    <w:link w:val="IntenseQuote"/>
+  <w:style w:type="character" w:customStyle="1" w:styleId="ac">
+    <w:name w:val="Интензивно цитиране Знак"/>
+    <w:basedOn w:val="a0"/>
+    <w:link w:val="ab"/>
     <w:uiPriority w:val="30"/>
     <w:rsid w:val="004D52F9"/>
     <w:rPr>
@@ -4933,9 +6998,9 @@
       <w:color w:val="0F4761" w:themeColor="accent1" w:themeShade="BF"/>
     </w:rPr>
   </w:style>
-  <w:style w:type="character" w:styleId="IntenseReference">
+  <w:style w:type="character" w:styleId="ad">
     <w:name w:val="Intense Reference"/>
-    <w:basedOn w:val="DefaultParagraphFont"/>
+    <w:basedOn w:val="a0"/>
     <w:uiPriority w:val="32"/>
     <w:qFormat/>
     <w:rsid w:val="004D52F9"/>
@@ -4947,9 +7012,9 @@
       <w:spacing w:val="5"/>
     </w:rPr>
   </w:style>
-  <w:style w:type="character" w:styleId="Hyperlink">
+  <w:style w:type="character" w:styleId="ae">
     <w:name w:val="Hyperlink"/>
-    <w:basedOn w:val="DefaultParagraphFont"/>
+    <w:basedOn w:val="a0"/>
     <w:uiPriority w:val="99"/>
     <w:unhideWhenUsed/>
     <w:rsid w:val="0043135C"/>
@@ -4958,10 +7023,10 @@
       <w:u w:val="single"/>
     </w:rPr>
   </w:style>
-  <w:style w:type="paragraph" w:styleId="TOC1">
+  <w:style w:type="paragraph" w:styleId="11">
     <w:name w:val="toc 1"/>
-    <w:basedOn w:val="Normal"/>
-    <w:next w:val="Normal"/>
+    <w:basedOn w:val="a"/>
+    <w:next w:val="a"/>
     <w:autoRedefine/>
     <w:uiPriority w:val="39"/>
     <w:unhideWhenUsed/>
@@ -4976,10 +7041,10 @@
       <w14:ligatures w14:val="none"/>
     </w:rPr>
   </w:style>
-  <w:style w:type="paragraph" w:styleId="TOCHeading">
+  <w:style w:type="paragraph" w:styleId="af">
     <w:name w:val="TOC Heading"/>
-    <w:basedOn w:val="Heading1"/>
-    <w:next w:val="Normal"/>
+    <w:basedOn w:val="1"/>
+    <w:next w:val="a"/>
     <w:uiPriority w:val="39"/>
     <w:unhideWhenUsed/>
     <w:qFormat/>
@@ -4996,9 +7061,9 @@
       <w14:ligatures w14:val="none"/>
     </w:rPr>
   </w:style>
-  <w:style w:type="table" w:styleId="TableGrid">
+  <w:style w:type="table" w:styleId="af0">
     <w:name w:val="Table Grid"/>
-    <w:basedOn w:val="TableNormal"/>
+    <w:basedOn w:val="a1"/>
     <w:uiPriority w:val="39"/>
     <w:rsid w:val="009E3BC8"/>
     <w:pPr>
@@ -5015,10 +7080,10 @@
       </w:tblBorders>
     </w:tblPr>
   </w:style>
-  <w:style w:type="paragraph" w:styleId="TOC2">
+  <w:style w:type="paragraph" w:styleId="21">
     <w:name w:val="toc 2"/>
-    <w:basedOn w:val="Normal"/>
-    <w:next w:val="Normal"/>
+    <w:basedOn w:val="a"/>
+    <w:next w:val="a"/>
     <w:autoRedefine/>
     <w:uiPriority w:val="39"/>
     <w:unhideWhenUsed/>
@@ -5028,10 +7093,10 @@
       <w:ind w:left="220"/>
     </w:pPr>
   </w:style>
-  <w:style w:type="paragraph" w:styleId="TOC3">
+  <w:style w:type="paragraph" w:styleId="31">
     <w:name w:val="toc 3"/>
-    <w:basedOn w:val="Normal"/>
-    <w:next w:val="Normal"/>
+    <w:basedOn w:val="a"/>
+    <w:next w:val="a"/>
     <w:autoRedefine/>
     <w:uiPriority w:val="39"/>
     <w:unhideWhenUsed/>
@@ -5041,18 +7106,18 @@
       <w:ind w:left="440"/>
     </w:pPr>
   </w:style>
-  <w:style w:type="character" w:styleId="LineNumber">
+  <w:style w:type="character" w:styleId="af1">
     <w:name w:val="line number"/>
-    <w:basedOn w:val="DefaultParagraphFont"/>
+    <w:basedOn w:val="a0"/>
     <w:uiPriority w:val="99"/>
     <w:semiHidden/>
     <w:unhideWhenUsed/>
     <w:rsid w:val="00403FF4"/>
   </w:style>
-  <w:style w:type="paragraph" w:styleId="Header">
+  <w:style w:type="paragraph" w:styleId="af2">
     <w:name w:val="header"/>
-    <w:basedOn w:val="Normal"/>
-    <w:link w:val="HeaderChar"/>
+    <w:basedOn w:val="a"/>
+    <w:link w:val="af3"/>
     <w:uiPriority w:val="99"/>
     <w:unhideWhenUsed/>
     <w:rsid w:val="00403FF4"/>
@@ -5064,17 +7129,17 @@
       <w:spacing w:after="0" w:line="240" w:lineRule="auto"/>
     </w:pPr>
   </w:style>
-  <w:style w:type="character" w:customStyle="1" w:styleId="HeaderChar">
-    <w:name w:val="Header Char"/>
-    <w:basedOn w:val="DefaultParagraphFont"/>
-    <w:link w:val="Header"/>
+  <w:style w:type="character" w:customStyle="1" w:styleId="af3">
+    <w:name w:val="Горен колонтитул Знак"/>
+    <w:basedOn w:val="a0"/>
+    <w:link w:val="af2"/>
     <w:uiPriority w:val="99"/>
     <w:rsid w:val="00403FF4"/>
   </w:style>
-  <w:style w:type="paragraph" w:styleId="Footer">
+  <w:style w:type="paragraph" w:styleId="af4">
     <w:name w:val="footer"/>
-    <w:basedOn w:val="Normal"/>
-    <w:link w:val="FooterChar"/>
+    <w:basedOn w:val="a"/>
+    <w:link w:val="af5"/>
     <w:uiPriority w:val="99"/>
     <w:unhideWhenUsed/>
     <w:rsid w:val="00403FF4"/>
@@ -5086,16 +7151,16 @@
       <w:spacing w:after="0" w:line="240" w:lineRule="auto"/>
     </w:pPr>
   </w:style>
-  <w:style w:type="character" w:customStyle="1" w:styleId="FooterChar">
-    <w:name w:val="Footer Char"/>
-    <w:basedOn w:val="DefaultParagraphFont"/>
-    <w:link w:val="Footer"/>
+  <w:style w:type="character" w:customStyle="1" w:styleId="af5">
+    <w:name w:val="Долен колонтитул Знак"/>
+    <w:basedOn w:val="a0"/>
+    <w:link w:val="af4"/>
     <w:uiPriority w:val="99"/>
     <w:rsid w:val="00403FF4"/>
   </w:style>
-  <w:style w:type="table" w:styleId="GridTable2-Accent2">
+  <w:style w:type="table" w:styleId="22">
     <w:name w:val="Grid Table 2 Accent 2"/>
-    <w:basedOn w:val="TableNormal"/>
+    <w:basedOn w:val="a1"/>
     <w:uiPriority w:val="47"/>
     <w:rsid w:val="00050590"/>
     <w:pPr>
@@ -5171,9 +7236,9 @@
       </w:tcPr>
     </w:tblStylePr>
   </w:style>
-  <w:style w:type="table" w:styleId="GridTable3-Accent2">
+  <w:style w:type="table" w:styleId="32">
     <w:name w:val="Grid Table 3 Accent 2"/>
-    <w:basedOn w:val="TableNormal"/>
+    <w:basedOn w:val="a1"/>
     <w:uiPriority w:val="48"/>
     <w:rsid w:val="00050590"/>
     <w:pPr>
@@ -5307,9 +7372,9 @@
       </w:tcPr>
     </w:tblStylePr>
   </w:style>
-  <w:style w:type="table" w:styleId="GridTable5Dark-Accent2">
+  <w:style w:type="table" w:styleId="52">
     <w:name w:val="Grid Table 5 Dark Accent 2"/>
-    <w:basedOn w:val="TableNormal"/>
+    <w:basedOn w:val="a1"/>
     <w:uiPriority w:val="50"/>
     <w:rsid w:val="00050590"/>
     <w:pPr>
@@ -5413,10 +7478,10 @@
       </w:tcPr>
     </w:tblStylePr>
   </w:style>
-  <w:style w:type="paragraph" w:styleId="EndnoteText">
+  <w:style w:type="paragraph" w:styleId="af6">
     <w:name w:val="endnote text"/>
-    <w:basedOn w:val="Normal"/>
-    <w:link w:val="EndnoteTextChar"/>
+    <w:basedOn w:val="a"/>
+    <w:link w:val="af7"/>
     <w:uiPriority w:val="99"/>
     <w:semiHidden/>
     <w:unhideWhenUsed/>
@@ -5429,10 +7494,10 @@
       <w:szCs w:val="20"/>
     </w:rPr>
   </w:style>
-  <w:style w:type="character" w:customStyle="1" w:styleId="EndnoteTextChar">
-    <w:name w:val="Endnote Text Char"/>
-    <w:basedOn w:val="DefaultParagraphFont"/>
-    <w:link w:val="EndnoteText"/>
+  <w:style w:type="character" w:customStyle="1" w:styleId="af7">
+    <w:name w:val="Текст на бележка в края Знак"/>
+    <w:basedOn w:val="a0"/>
+    <w:link w:val="af6"/>
     <w:uiPriority w:val="99"/>
     <w:semiHidden/>
     <w:rsid w:val="004B7242"/>
@@ -5441,9 +7506,9 @@
       <w:szCs w:val="20"/>
     </w:rPr>
   </w:style>
-  <w:style w:type="character" w:styleId="EndnoteReference">
+  <w:style w:type="character" w:styleId="af8">
     <w:name w:val="endnote reference"/>
-    <w:basedOn w:val="DefaultParagraphFont"/>
+    <w:basedOn w:val="a0"/>
     <w:uiPriority w:val="99"/>
     <w:semiHidden/>
     <w:unhideWhenUsed/>
@@ -5755,7 +7820,7 @@
 </file>
 
 <file path=customXml/itemProps1.xml><?xml version="1.0" encoding="utf-8"?>
-<ds:datastoreItem xmlns:ds="http://schemas.openxmlformats.org/officeDocument/2006/customXml" ds:itemID="{6932EC0B-903B-4AF2-A381-2B4467257547}">
+<ds:datastoreItem xmlns:ds="http://schemas.openxmlformats.org/officeDocument/2006/customXml" ds:itemID="{AE7303EE-D7BC-4C36-8739-F8DBFF776026}">
   <ds:schemaRefs>
     <ds:schemaRef ds:uri="http://schemas.openxmlformats.org/officeDocument/2006/bibliography"/>
   </ds:schemaRefs>

</xml_diff>